<commit_message>
Update app.py, predict.py, preprocess.py and add capture tool
</commit_message>
<xml_diff>
--- a/docs/Bao_cao_Cuoi_ky_HOG_SVM.docx
+++ b/docs/Bao_cao_Cuoi_ky_HOG_SVM.docx
@@ -330,30 +330,61 @@
           <w:sz w:val="32"/>
           <w:szCs w:val="32"/>
         </w:rPr>
-        <w:t xml:space="preserve">LỜI CẢM ƠN</w:t>
-      </w:r>
-    </w:p>
-    <w:p>
-      <w:pPr>
-        <w:spacing w:after="160" w:line="360"/>
-        <w:jc w:val="both"/>
-      </w:pPr>
-      <w:r>
-        <w:rPr>
-          <w:rFonts w:ascii="Times New Roman" w:cs="Times New Roman" w:eastAsia="Times New Roman" w:hAnsi="Times New Roman"/>
-          <w:b w:val="false"/>
-          <w:bCs w:val="false"/>
-          <w:i w:val="false"/>
-          <w:iCs w:val="false"/>
-          <w:sz w:val="26"/>
-          <w:szCs w:val="26"/>
-        </w:rPr>
-        <w:t xml:space="preserve">Nhóm xin gửi lời cảm ơn đến giảng viên bộ môn Thị giác máy tính đã hướng dẫn và giải đáp các thắc mắc trong suốt quá trình thực hiện đồ án, đặc biệt là phần lý thuyết về Image Gradient, HOG và SVM được vận dụng trực tiếp vào đề tài mở rộng của nhóm. Nhóm cũng cảm ơn nhau vì đã phối hợp xử lý các vấn đề phát sinh trong lúc cài đặt môi trường và thu thập dữ liệu, để hoàn thành đồ án đúng thời hạn.</w:t>
-      </w:r>
-    </w:p>
-    <w:p>
-      <w:r>
-        <w:br w:type="page"/>
+        <w:t xml:space="preserve">LỜI CAM ĐOAN</w:t>
+      </w:r>
+    </w:p>
+    <w:p>
+      <w:pPr>
+        <w:spacing w:after="160" w:line="340"/>
+        <w:jc w:val="both"/>
+      </w:pPr>
+      <w:r>
+        <w:rPr>
+          <w:rFonts w:ascii="Times New Roman" w:cs="Times New Roman" w:eastAsia="Times New Roman" w:hAnsi="Times New Roman"/>
+          <w:b w:val="false"/>
+          <w:bCs w:val="false"/>
+          <w:i w:val="false"/>
+          <w:iCs w:val="false"/>
+          <w:sz w:val="26"/>
+          <w:szCs w:val="26"/>
+        </w:rPr>
+        <w:t xml:space="preserve">Chúng tôi xin cam đoan đây là công trình nghiên cứu và phát triển hệ thống của riêng nhóm. Các kết quả, số liệu và hình ảnh trong báo cáo này là trung thực và chưa từng được công bố trong bất kỳ công trình nào khác.</w:t>
+      </w:r>
+    </w:p>
+    <w:p>
+      <w:pPr>
+        <w:spacing w:after="160" w:line="340"/>
+        <w:jc w:val="both"/>
+      </w:pPr>
+      <w:r>
+        <w:rPr>
+          <w:rFonts w:ascii="Times New Roman" w:cs="Times New Roman" w:eastAsia="Times New Roman" w:hAnsi="Times New Roman"/>
+          <w:b w:val="false"/>
+          <w:bCs w:val="false"/>
+          <w:i w:val="false"/>
+          <w:iCs w:val="false"/>
+          <w:sz w:val="26"/>
+          <w:szCs w:val="26"/>
+        </w:rPr>
+        <w:t xml:space="preserve">Trong quá trình xây dựng hệ thống, nhóm có sử dụng các thư viện mã nguồn mở (OpenCV, scikit-learn, Streamlit) và các thuật toán học máy kinh điển (HOG, SVM). Toàn bộ nguồn tài liệu tham khảo, các bộ thư viện có sẵn đều được nhóm trích dẫn rõ ràng trong phần Tài liệu tham khảo.</w:t>
+      </w:r>
+    </w:p>
+    <w:p>
+      <w:pPr>
+        <w:spacing w:after="160" w:line="340"/>
+        <w:jc w:val="both"/>
+      </w:pPr>
+      <w:r>
+        <w:rPr>
+          <w:rFonts w:ascii="Times New Roman" w:cs="Times New Roman" w:eastAsia="Times New Roman" w:hAnsi="Times New Roman"/>
+          <w:b w:val="false"/>
+          <w:bCs w:val="false"/>
+          <w:i w:val="false"/>
+          <w:iCs w:val="false"/>
+          <w:sz w:val="26"/>
+          <w:szCs w:val="26"/>
+        </w:rPr>
+        <w:t xml:space="preserve">Việc thu thập dữ liệu (dataset), trích xuất đặc trưng và xây dựng logic luồng hoạt động của hệ thống điểm danh, chống giả mạo đều do nhóm tự thực hiện. Nếu có bất kỳ sự gian lận nào, nhóm xin chịu hoàn toàn trách nhiệm trước Hội đồng.</w:t>
       </w:r>
     </w:p>
     <w:p>
@@ -370,420 +401,27 @@
           <w:sz w:val="32"/>
           <w:szCs w:val="32"/>
         </w:rPr>
-        <w:t xml:space="preserve">DANH MỤC TỪ VIẾT TẮT</w:t>
-      </w:r>
-    </w:p>
-    <w:tbl>
-      <w:tblPr>
-        <w:tblW w:type="dxa" w:w="9000"/>
-        <w:tblBorders>
-          <w:top w:val="single" w:color="auto" w:sz="4"/>
-          <w:left w:val="single" w:color="auto" w:sz="4"/>
-          <w:bottom w:val="single" w:color="auto" w:sz="4"/>
-          <w:right w:val="single" w:color="auto" w:sz="4"/>
-          <w:insideH w:val="single" w:color="auto" w:sz="4"/>
-          <w:insideV w:val="single" w:color="auto" w:sz="4"/>
-        </w:tblBorders>
-      </w:tblPr>
-      <w:tblGrid>
-        <w:gridCol w:w="100"/>
-        <w:gridCol w:w="100"/>
-      </w:tblGrid>
-      <w:tr>
-        <w:tc>
-          <w:tcPr>
-            <w:tcW w:type="dxa" w:w="2200"/>
-            <w:shd w:fill="D9E2F3" w:val="clear"/>
-            <w:tcMar>
-              <w:top w:type="dxa" w:w="80"/>
-              <w:left w:type="dxa" w:w="100"/>
-              <w:bottom w:type="dxa" w:w="80"/>
-              <w:right w:type="dxa" w:w="100"/>
-            </w:tcMar>
-            <w:vAlign w:val="center"/>
-          </w:tcPr>
-          <w:p>
-            <w:pPr>
-              <w:jc w:val="center"/>
-            </w:pPr>
-            <w:r>
-              <w:rPr>
-                <w:rFonts w:ascii="Times New Roman" w:cs="Times New Roman" w:eastAsia="Times New Roman" w:hAnsi="Times New Roman"/>
-                <w:b/>
-                <w:bCs/>
-                <w:sz w:val="24"/>
-                <w:szCs w:val="24"/>
-              </w:rPr>
-              <w:t xml:space="preserve">Từ viết tắt</w:t>
-            </w:r>
-          </w:p>
-        </w:tc>
-        <w:tc>
-          <w:tcPr>
-            <w:tcW w:type="dxa" w:w="6800"/>
-            <w:shd w:fill="D9E2F3" w:val="clear"/>
-            <w:tcMar>
-              <w:top w:type="dxa" w:w="80"/>
-              <w:left w:type="dxa" w:w="100"/>
-              <w:bottom w:type="dxa" w:w="80"/>
-              <w:right w:type="dxa" w:w="100"/>
-            </w:tcMar>
-            <w:vAlign w:val="center"/>
-          </w:tcPr>
-          <w:p>
-            <w:pPr>
-              <w:jc w:val="center"/>
-            </w:pPr>
-            <w:r>
-              <w:rPr>
-                <w:rFonts w:ascii="Times New Roman" w:cs="Times New Roman" w:eastAsia="Times New Roman" w:hAnsi="Times New Roman"/>
-                <w:b/>
-                <w:bCs/>
-                <w:sz w:val="24"/>
-                <w:szCs w:val="24"/>
-              </w:rPr>
-              <w:t xml:space="preserve">Giải thích</w:t>
-            </w:r>
-          </w:p>
-        </w:tc>
-      </w:tr>
-      <w:tr>
-        <w:tc>
-          <w:tcPr>
-            <w:tcW w:type="dxa" w:w="2200"/>
-            <w:tcMar>
-              <w:top w:type="dxa" w:w="80"/>
-              <w:left w:type="dxa" w:w="100"/>
-              <w:bottom w:type="dxa" w:w="80"/>
-              <w:right w:type="dxa" w:w="100"/>
-            </w:tcMar>
-            <w:vAlign w:val="center"/>
-          </w:tcPr>
-          <w:p>
-            <w:pPr>
-              <w:jc w:val="center"/>
-            </w:pPr>
-            <w:r>
-              <w:rPr>
-                <w:rFonts w:ascii="Times New Roman" w:cs="Times New Roman" w:eastAsia="Times New Roman" w:hAnsi="Times New Roman"/>
-                <w:b w:val="false"/>
-                <w:bCs w:val="false"/>
-                <w:sz w:val="24"/>
-                <w:szCs w:val="24"/>
-              </w:rPr>
-              <w:t xml:space="preserve">HOG</w:t>
-            </w:r>
-          </w:p>
-        </w:tc>
-        <w:tc>
-          <w:tcPr>
-            <w:tcW w:type="dxa" w:w="6800"/>
-            <w:tcMar>
-              <w:top w:type="dxa" w:w="80"/>
-              <w:left w:type="dxa" w:w="100"/>
-              <w:bottom w:type="dxa" w:w="80"/>
-              <w:right w:type="dxa" w:w="100"/>
-            </w:tcMar>
-            <w:vAlign w:val="center"/>
-          </w:tcPr>
-          <w:p>
-            <w:pPr>
-              <w:jc w:val="left"/>
-            </w:pPr>
-            <w:r>
-              <w:rPr>
-                <w:rFonts w:ascii="Times New Roman" w:cs="Times New Roman" w:eastAsia="Times New Roman" w:hAnsi="Times New Roman"/>
-                <w:b w:val="false"/>
-                <w:bCs w:val="false"/>
-                <w:sz w:val="24"/>
-                <w:szCs w:val="24"/>
-              </w:rPr>
-              <w:t xml:space="preserve">Histogram of Oriented Gradients</w:t>
-            </w:r>
-          </w:p>
-        </w:tc>
-      </w:tr>
-      <w:tr>
-        <w:tc>
-          <w:tcPr>
-            <w:tcW w:type="dxa" w:w="2200"/>
-            <w:tcMar>
-              <w:top w:type="dxa" w:w="80"/>
-              <w:left w:type="dxa" w:w="100"/>
-              <w:bottom w:type="dxa" w:w="80"/>
-              <w:right w:type="dxa" w:w="100"/>
-            </w:tcMar>
-            <w:vAlign w:val="center"/>
-          </w:tcPr>
-          <w:p>
-            <w:pPr>
-              <w:jc w:val="center"/>
-            </w:pPr>
-            <w:r>
-              <w:rPr>
-                <w:rFonts w:ascii="Times New Roman" w:cs="Times New Roman" w:eastAsia="Times New Roman" w:hAnsi="Times New Roman"/>
-                <w:b w:val="false"/>
-                <w:bCs w:val="false"/>
-                <w:sz w:val="24"/>
-                <w:szCs w:val="24"/>
-              </w:rPr>
-              <w:t xml:space="preserve">SVM</w:t>
-            </w:r>
-          </w:p>
-        </w:tc>
-        <w:tc>
-          <w:tcPr>
-            <w:tcW w:type="dxa" w:w="6800"/>
-            <w:tcMar>
-              <w:top w:type="dxa" w:w="80"/>
-              <w:left w:type="dxa" w:w="100"/>
-              <w:bottom w:type="dxa" w:w="80"/>
-              <w:right w:type="dxa" w:w="100"/>
-            </w:tcMar>
-            <w:vAlign w:val="center"/>
-          </w:tcPr>
-          <w:p>
-            <w:pPr>
-              <w:jc w:val="left"/>
-            </w:pPr>
-            <w:r>
-              <w:rPr>
-                <w:rFonts w:ascii="Times New Roman" w:cs="Times New Roman" w:eastAsia="Times New Roman" w:hAnsi="Times New Roman"/>
-                <w:b w:val="false"/>
-                <w:bCs w:val="false"/>
-                <w:sz w:val="24"/>
-                <w:szCs w:val="24"/>
-              </w:rPr>
-              <w:t xml:space="preserve">Support Vector Machine</w:t>
-            </w:r>
-          </w:p>
-        </w:tc>
-      </w:tr>
-      <w:tr>
-        <w:tc>
-          <w:tcPr>
-            <w:tcW w:type="dxa" w:w="2200"/>
-            <w:tcMar>
-              <w:top w:type="dxa" w:w="80"/>
-              <w:left w:type="dxa" w:w="100"/>
-              <w:bottom w:type="dxa" w:w="80"/>
-              <w:right w:type="dxa" w:w="100"/>
-            </w:tcMar>
-            <w:vAlign w:val="center"/>
-          </w:tcPr>
-          <w:p>
-            <w:pPr>
-              <w:jc w:val="center"/>
-            </w:pPr>
-            <w:r>
-              <w:rPr>
-                <w:rFonts w:ascii="Times New Roman" w:cs="Times New Roman" w:eastAsia="Times New Roman" w:hAnsi="Times New Roman"/>
-                <w:b w:val="false"/>
-                <w:bCs w:val="false"/>
-                <w:sz w:val="24"/>
-                <w:szCs w:val="24"/>
-              </w:rPr>
-              <w:t xml:space="preserve">ROI</w:t>
-            </w:r>
-          </w:p>
-        </w:tc>
-        <w:tc>
-          <w:tcPr>
-            <w:tcW w:type="dxa" w:w="6800"/>
-            <w:tcMar>
-              <w:top w:type="dxa" w:w="80"/>
-              <w:left w:type="dxa" w:w="100"/>
-              <w:bottom w:type="dxa" w:w="80"/>
-              <w:right w:type="dxa" w:w="100"/>
-            </w:tcMar>
-            <w:vAlign w:val="center"/>
-          </w:tcPr>
-          <w:p>
-            <w:pPr>
-              <w:jc w:val="left"/>
-            </w:pPr>
-            <w:r>
-              <w:rPr>
-                <w:rFonts w:ascii="Times New Roman" w:cs="Times New Roman" w:eastAsia="Times New Roman" w:hAnsi="Times New Roman"/>
-                <w:b w:val="false"/>
-                <w:bCs w:val="false"/>
-                <w:sz w:val="24"/>
-                <w:szCs w:val="24"/>
-              </w:rPr>
-              <w:t xml:space="preserve">Region of Interest (vùng quan tâm)</w:t>
-            </w:r>
-          </w:p>
-        </w:tc>
-      </w:tr>
-      <w:tr>
-        <w:tc>
-          <w:tcPr>
-            <w:tcW w:type="dxa" w:w="2200"/>
-            <w:tcMar>
-              <w:top w:type="dxa" w:w="80"/>
-              <w:left w:type="dxa" w:w="100"/>
-              <w:bottom w:type="dxa" w:w="80"/>
-              <w:right w:type="dxa" w:w="100"/>
-            </w:tcMar>
-            <w:vAlign w:val="center"/>
-          </w:tcPr>
-          <w:p>
-            <w:pPr>
-              <w:jc w:val="center"/>
-            </w:pPr>
-            <w:r>
-              <w:rPr>
-                <w:rFonts w:ascii="Times New Roman" w:cs="Times New Roman" w:eastAsia="Times New Roman" w:hAnsi="Times New Roman"/>
-                <w:b w:val="false"/>
-                <w:bCs w:val="false"/>
-                <w:sz w:val="24"/>
-                <w:szCs w:val="24"/>
-              </w:rPr>
-              <w:t xml:space="preserve">FPS</w:t>
-            </w:r>
-          </w:p>
-        </w:tc>
-        <w:tc>
-          <w:tcPr>
-            <w:tcW w:type="dxa" w:w="6800"/>
-            <w:tcMar>
-              <w:top w:type="dxa" w:w="80"/>
-              <w:left w:type="dxa" w:w="100"/>
-              <w:bottom w:type="dxa" w:w="80"/>
-              <w:right w:type="dxa" w:w="100"/>
-            </w:tcMar>
-            <w:vAlign w:val="center"/>
-          </w:tcPr>
-          <w:p>
-            <w:pPr>
-              <w:jc w:val="left"/>
-            </w:pPr>
-            <w:r>
-              <w:rPr>
-                <w:rFonts w:ascii="Times New Roman" w:cs="Times New Roman" w:eastAsia="Times New Roman" w:hAnsi="Times New Roman"/>
-                <w:b w:val="false"/>
-                <w:bCs w:val="false"/>
-                <w:sz w:val="24"/>
-                <w:szCs w:val="24"/>
-              </w:rPr>
-              <w:t xml:space="preserve">Frames Per Second (số khung hình mỗi giây)</w:t>
-            </w:r>
-          </w:p>
-        </w:tc>
-      </w:tr>
-      <w:tr>
-        <w:tc>
-          <w:tcPr>
-            <w:tcW w:type="dxa" w:w="2200"/>
-            <w:tcMar>
-              <w:top w:type="dxa" w:w="80"/>
-              <w:left w:type="dxa" w:w="100"/>
-              <w:bottom w:type="dxa" w:w="80"/>
-              <w:right w:type="dxa" w:w="100"/>
-            </w:tcMar>
-            <w:vAlign w:val="center"/>
-          </w:tcPr>
-          <w:p>
-            <w:pPr>
-              <w:jc w:val="center"/>
-            </w:pPr>
-            <w:r>
-              <w:rPr>
-                <w:rFonts w:ascii="Times New Roman" w:cs="Times New Roman" w:eastAsia="Times New Roman" w:hAnsi="Times New Roman"/>
-                <w:b w:val="false"/>
-                <w:bCs w:val="false"/>
-                <w:sz w:val="24"/>
-                <w:szCs w:val="24"/>
-              </w:rPr>
-              <w:t xml:space="preserve">OvR</w:t>
-            </w:r>
-          </w:p>
-        </w:tc>
-        <w:tc>
-          <w:tcPr>
-            <w:tcW w:type="dxa" w:w="6800"/>
-            <w:tcMar>
-              <w:top w:type="dxa" w:w="80"/>
-              <w:left w:type="dxa" w:w="100"/>
-              <w:bottom w:type="dxa" w:w="80"/>
-              <w:right w:type="dxa" w:w="100"/>
-            </w:tcMar>
-            <w:vAlign w:val="center"/>
-          </w:tcPr>
-          <w:p>
-            <w:pPr>
-              <w:jc w:val="left"/>
-            </w:pPr>
-            <w:r>
-              <w:rPr>
-                <w:rFonts w:ascii="Times New Roman" w:cs="Times New Roman" w:eastAsia="Times New Roman" w:hAnsi="Times New Roman"/>
-                <w:b w:val="false"/>
-                <w:bCs w:val="false"/>
-                <w:sz w:val="24"/>
-                <w:szCs w:val="24"/>
-              </w:rPr>
-              <w:t xml:space="preserve">One-vs-Rest, chiến lược mở rộng bộ phân loại nhị phân cho nhiều lớp</w:t>
-            </w:r>
-          </w:p>
-        </w:tc>
-      </w:tr>
-      <w:tr>
-        <w:tc>
-          <w:tcPr>
-            <w:tcW w:type="dxa" w:w="2200"/>
-            <w:tcMar>
-              <w:top w:type="dxa" w:w="80"/>
-              <w:left w:type="dxa" w:w="100"/>
-              <w:bottom w:type="dxa" w:w="80"/>
-              <w:right w:type="dxa" w:w="100"/>
-            </w:tcMar>
-            <w:vAlign w:val="center"/>
-          </w:tcPr>
-          <w:p>
-            <w:pPr>
-              <w:jc w:val="center"/>
-            </w:pPr>
-            <w:r>
-              <w:rPr>
-                <w:rFonts w:ascii="Times New Roman" w:cs="Times New Roman" w:eastAsia="Times New Roman" w:hAnsi="Times New Roman"/>
-                <w:b w:val="false"/>
-                <w:bCs w:val="false"/>
-                <w:sz w:val="24"/>
-                <w:szCs w:val="24"/>
-              </w:rPr>
-              <w:t xml:space="preserve">CNN</w:t>
-            </w:r>
-          </w:p>
-        </w:tc>
-        <w:tc>
-          <w:tcPr>
-            <w:tcW w:type="dxa" w:w="6800"/>
-            <w:tcMar>
-              <w:top w:type="dxa" w:w="80"/>
-              <w:left w:type="dxa" w:w="100"/>
-              <w:bottom w:type="dxa" w:w="80"/>
-              <w:right w:type="dxa" w:w="100"/>
-            </w:tcMar>
-            <w:vAlign w:val="center"/>
-          </w:tcPr>
-          <w:p>
-            <w:pPr>
-              <w:jc w:val="left"/>
-            </w:pPr>
-            <w:r>
-              <w:rPr>
-                <w:rFonts w:ascii="Times New Roman" w:cs="Times New Roman" w:eastAsia="Times New Roman" w:hAnsi="Times New Roman"/>
-                <w:b w:val="false"/>
-                <w:bCs w:val="false"/>
-                <w:sz w:val="24"/>
-                <w:szCs w:val="24"/>
-              </w:rPr>
-              <w:t xml:space="preserve">Convolutional Neural Network</w:t>
-            </w:r>
-          </w:p>
-        </w:tc>
-      </w:tr>
-    </w:tbl>
+        <w:t xml:space="preserve">LỜI CẢM ƠN</w:t>
+      </w:r>
+    </w:p>
+    <w:p>
+      <w:pPr>
+        <w:spacing w:after="160" w:line="340"/>
+        <w:jc w:val="both"/>
+      </w:pPr>
+      <w:r>
+        <w:rPr>
+          <w:rFonts w:ascii="Times New Roman" w:cs="Times New Roman" w:eastAsia="Times New Roman" w:hAnsi="Times New Roman"/>
+          <w:b w:val="false"/>
+          <w:bCs w:val="false"/>
+          <w:i w:val="false"/>
+          <w:iCs w:val="false"/>
+          <w:sz w:val="26"/>
+          <w:szCs w:val="26"/>
+        </w:rPr>
+        <w:t xml:space="preserve">Nhóm xin gửi lời cảm ơn đến giảng viên bộ môn Thị giác máy tính đã hướng dẫn và giải đáp các thắc mắc trong suốt quá trình thực hiện đồ án, đặc biệt là phần lý thuyết về Image Gradient, HOG và SVM được vận dụng trực tiếp vào đề tài mở rộng của nhóm. Nhóm cũng cảm ơn nhau vì đã phối hợp xử lý các vấn đề phát sinh trong lúc cài đặt môi trường và thu thập dữ liệu, để hoàn thành đồ án đúng thời hạn.</w:t>
+      </w:r>
+    </w:p>
     <w:p>
       <w:r>
         <w:br w:type="page"/>
@@ -808,7 +446,43 @@
     </w:p>
     <w:p>
       <w:pPr>
-        <w:spacing w:after="160" w:line="360"/>
+        <w:spacing w:after="160" w:line="340"/>
+        <w:jc w:val="both"/>
+      </w:pPr>
+      <w:r>
+        <w:rPr>
+          <w:rFonts w:ascii="Times New Roman" w:cs="Times New Roman" w:eastAsia="Times New Roman" w:hAnsi="Times New Roman"/>
+          <w:b w:val="false"/>
+          <w:bCs w:val="false"/>
+          <w:i w:val="false"/>
+          <w:iCs w:val="false"/>
+          <w:sz w:val="26"/>
+          <w:szCs w:val="26"/>
+        </w:rPr>
+        <w:t xml:space="preserve">Lời cam đoan</w:t>
+      </w:r>
+    </w:p>
+    <w:p>
+      <w:pPr>
+        <w:spacing w:after="160" w:line="340"/>
+        <w:jc w:val="both"/>
+      </w:pPr>
+      <w:r>
+        <w:rPr>
+          <w:rFonts w:ascii="Times New Roman" w:cs="Times New Roman" w:eastAsia="Times New Roman" w:hAnsi="Times New Roman"/>
+          <w:b w:val="false"/>
+          <w:bCs w:val="false"/>
+          <w:i w:val="false"/>
+          <w:iCs w:val="false"/>
+          <w:sz w:val="26"/>
+          <w:szCs w:val="26"/>
+        </w:rPr>
+        <w:t xml:space="preserve">Lời cảm ơn</w:t>
+      </w:r>
+    </w:p>
+    <w:p>
+      <w:pPr>
+        <w:spacing w:after="160" w:line="340"/>
         <w:jc w:val="both"/>
       </w:pPr>
       <w:r>
@@ -826,7 +500,7 @@
     </w:p>
     <w:p>
       <w:pPr>
-        <w:spacing w:after="160" w:line="360"/>
+        <w:spacing w:after="160" w:line="340"/>
         <w:ind w:left="400"/>
         <w:jc w:val="both"/>
       </w:pPr>
@@ -845,7 +519,7 @@
     </w:p>
     <w:p>
       <w:pPr>
-        <w:spacing w:after="160" w:line="360"/>
+        <w:spacing w:after="160" w:line="340"/>
         <w:ind w:left="400"/>
         <w:jc w:val="both"/>
       </w:pPr>
@@ -864,7 +538,7 @@
     </w:p>
     <w:p>
       <w:pPr>
-        <w:spacing w:after="160" w:line="360"/>
+        <w:spacing w:after="160" w:line="340"/>
         <w:ind w:left="400"/>
         <w:jc w:val="both"/>
       </w:pPr>
@@ -883,7 +557,7 @@
     </w:p>
     <w:p>
       <w:pPr>
-        <w:spacing w:after="160" w:line="360"/>
+        <w:spacing w:after="160" w:line="340"/>
         <w:ind w:left="400"/>
         <w:jc w:val="both"/>
       </w:pPr>
@@ -902,7 +576,26 @@
     </w:p>
     <w:p>
       <w:pPr>
-        <w:spacing w:after="160" w:line="360"/>
+        <w:spacing w:after="160" w:line="340"/>
+        <w:ind w:left="400"/>
+        <w:jc w:val="both"/>
+      </w:pPr>
+      <w:r>
+        <w:rPr>
+          <w:rFonts w:ascii="Times New Roman" w:cs="Times New Roman" w:eastAsia="Times New Roman" w:hAnsi="Times New Roman"/>
+          <w:b w:val="false"/>
+          <w:bCs w:val="false"/>
+          <w:i w:val="false"/>
+          <w:iCs w:val="false"/>
+          <w:sz w:val="26"/>
+          <w:szCs w:val="26"/>
+        </w:rPr>
+        <w:t xml:space="preserve">     1.5. Phương pháp tiếp cận và công cụ sử dụng</w:t>
+      </w:r>
+    </w:p>
+    <w:p>
+      <w:pPr>
+        <w:spacing w:after="160" w:line="340"/>
         <w:jc w:val="both"/>
       </w:pPr>
       <w:r>
@@ -920,7 +613,7 @@
     </w:p>
     <w:p>
       <w:pPr>
-        <w:spacing w:after="160" w:line="360"/>
+        <w:spacing w:after="160" w:line="340"/>
         <w:ind w:left="400"/>
         <w:jc w:val="both"/>
       </w:pPr>
@@ -939,7 +632,7 @@
     </w:p>
     <w:p>
       <w:pPr>
-        <w:spacing w:after="160" w:line="360"/>
+        <w:spacing w:after="160" w:line="340"/>
         <w:ind w:left="400"/>
         <w:jc w:val="both"/>
       </w:pPr>
@@ -958,7 +651,7 @@
     </w:p>
     <w:p>
       <w:pPr>
-        <w:spacing w:after="160" w:line="360"/>
+        <w:spacing w:after="160" w:line="340"/>
         <w:ind w:left="400"/>
         <w:jc w:val="both"/>
       </w:pPr>
@@ -977,7 +670,7 @@
     </w:p>
     <w:p>
       <w:pPr>
-        <w:spacing w:after="160" w:line="360"/>
+        <w:spacing w:after="160" w:line="340"/>
         <w:ind w:left="400"/>
         <w:jc w:val="both"/>
       </w:pPr>
@@ -996,7 +689,7 @@
     </w:p>
     <w:p>
       <w:pPr>
-        <w:spacing w:after="160" w:line="360"/>
+        <w:spacing w:after="160" w:line="340"/>
         <w:jc w:val="both"/>
       </w:pPr>
       <w:r>
@@ -1014,7 +707,7 @@
     </w:p>
     <w:p>
       <w:pPr>
-        <w:spacing w:after="160" w:line="360"/>
+        <w:spacing w:after="160" w:line="340"/>
         <w:ind w:left="400"/>
         <w:jc w:val="both"/>
       </w:pPr>
@@ -1033,7 +726,7 @@
     </w:p>
     <w:p>
       <w:pPr>
-        <w:spacing w:after="160" w:line="360"/>
+        <w:spacing w:after="160" w:line="340"/>
         <w:ind w:left="400"/>
         <w:jc w:val="both"/>
       </w:pPr>
@@ -1052,7 +745,7 @@
     </w:p>
     <w:p>
       <w:pPr>
-        <w:spacing w:after="160" w:line="360"/>
+        <w:spacing w:after="160" w:line="340"/>
         <w:ind w:left="400"/>
         <w:jc w:val="both"/>
       </w:pPr>
@@ -1071,7 +764,7 @@
     </w:p>
     <w:p>
       <w:pPr>
-        <w:spacing w:after="160" w:line="360"/>
+        <w:spacing w:after="160" w:line="340"/>
         <w:ind w:left="400"/>
         <w:jc w:val="both"/>
       </w:pPr>
@@ -1090,7 +783,7 @@
     </w:p>
     <w:p>
       <w:pPr>
-        <w:spacing w:after="160" w:line="360"/>
+        <w:spacing w:after="160" w:line="340"/>
         <w:ind w:left="400"/>
         <w:jc w:val="both"/>
       </w:pPr>
@@ -1109,7 +802,7 @@
     </w:p>
     <w:p>
       <w:pPr>
-        <w:spacing w:after="160" w:line="360"/>
+        <w:spacing w:after="160" w:line="340"/>
         <w:ind w:left="400"/>
         <w:jc w:val="both"/>
       </w:pPr>
@@ -1128,7 +821,7 @@
     </w:p>
     <w:p>
       <w:pPr>
-        <w:spacing w:after="160" w:line="360"/>
+        <w:spacing w:after="160" w:line="340"/>
         <w:jc w:val="both"/>
       </w:pPr>
       <w:r>
@@ -1146,7 +839,7 @@
     </w:p>
     <w:p>
       <w:pPr>
-        <w:spacing w:after="160" w:line="360"/>
+        <w:spacing w:after="160" w:line="340"/>
         <w:ind w:left="400"/>
         <w:jc w:val="both"/>
       </w:pPr>
@@ -1165,7 +858,7 @@
     </w:p>
     <w:p>
       <w:pPr>
-        <w:spacing w:after="160" w:line="360"/>
+        <w:spacing w:after="160" w:line="340"/>
         <w:ind w:left="400"/>
         <w:jc w:val="both"/>
       </w:pPr>
@@ -1179,12 +872,12 @@
           <w:sz w:val="26"/>
           <w:szCs w:val="26"/>
         </w:rPr>
-        <w:t xml:space="preserve">     4.2. Thu thập dữ liệu</w:t>
-      </w:r>
-    </w:p>
-    <w:p>
-      <w:pPr>
-        <w:spacing w:after="160" w:line="360"/>
+        <w:t xml:space="preserve">     4.2. Thu thập và xây dựng dữ liệu</w:t>
+      </w:r>
+    </w:p>
+    <w:p>
+      <w:pPr>
+        <w:spacing w:after="160" w:line="340"/>
         <w:ind w:left="400"/>
         <w:jc w:val="both"/>
       </w:pPr>
@@ -1203,7 +896,7 @@
     </w:p>
     <w:p>
       <w:pPr>
-        <w:spacing w:after="160" w:line="360"/>
+        <w:spacing w:after="160" w:line="340"/>
         <w:ind w:left="400"/>
         <w:jc w:val="both"/>
       </w:pPr>
@@ -1222,7 +915,7 @@
     </w:p>
     <w:p>
       <w:pPr>
-        <w:spacing w:after="160" w:line="360"/>
+        <w:spacing w:after="160" w:line="340"/>
         <w:ind w:left="400"/>
         <w:jc w:val="both"/>
       </w:pPr>
@@ -1241,7 +934,7 @@
     </w:p>
     <w:p>
       <w:pPr>
-        <w:spacing w:after="160" w:line="360"/>
+        <w:spacing w:after="160" w:line="340"/>
         <w:ind w:left="400"/>
         <w:jc w:val="both"/>
       </w:pPr>
@@ -1260,7 +953,7 @@
     </w:p>
     <w:p>
       <w:pPr>
-        <w:spacing w:after="160" w:line="360"/>
+        <w:spacing w:after="160" w:line="340"/>
         <w:jc w:val="both"/>
       </w:pPr>
       <w:r>
@@ -1278,7 +971,7 @@
     </w:p>
     <w:p>
       <w:pPr>
-        <w:spacing w:after="160" w:line="360"/>
+        <w:spacing w:after="160" w:line="340"/>
         <w:ind w:left="400"/>
         <w:jc w:val="both"/>
       </w:pPr>
@@ -1297,7 +990,7 @@
     </w:p>
     <w:p>
       <w:pPr>
-        <w:spacing w:after="160" w:line="360"/>
+        <w:spacing w:after="160" w:line="340"/>
         <w:ind w:left="400"/>
         <w:jc w:val="both"/>
       </w:pPr>
@@ -1316,7 +1009,7 @@
     </w:p>
     <w:p>
       <w:pPr>
-        <w:spacing w:after="160" w:line="360"/>
+        <w:spacing w:after="160" w:line="340"/>
         <w:ind w:left="400"/>
         <w:jc w:val="both"/>
       </w:pPr>
@@ -1335,7 +1028,7 @@
     </w:p>
     <w:p>
       <w:pPr>
-        <w:spacing w:after="160" w:line="360"/>
+        <w:spacing w:after="160" w:line="340"/>
         <w:ind w:left="400"/>
         <w:jc w:val="both"/>
       </w:pPr>
@@ -1354,7 +1047,7 @@
     </w:p>
     <w:p>
       <w:pPr>
-        <w:spacing w:after="160" w:line="360"/>
+        <w:spacing w:after="160" w:line="340"/>
         <w:jc w:val="both"/>
       </w:pPr>
       <w:r>
@@ -1372,7 +1065,7 @@
     </w:p>
     <w:p>
       <w:pPr>
-        <w:spacing w:after="160" w:line="360"/>
+        <w:spacing w:after="160" w:line="340"/>
         <w:ind w:left="400"/>
         <w:jc w:val="both"/>
       </w:pPr>
@@ -1391,7 +1084,7 @@
     </w:p>
     <w:p>
       <w:pPr>
-        <w:spacing w:after="160" w:line="360"/>
+        <w:spacing w:after="160" w:line="340"/>
         <w:ind w:left="400"/>
         <w:jc w:val="both"/>
       </w:pPr>
@@ -1410,7 +1103,7 @@
     </w:p>
     <w:p>
       <w:pPr>
-        <w:spacing w:after="160" w:line="360"/>
+        <w:spacing w:after="160" w:line="340"/>
         <w:ind w:left="400"/>
         <w:jc w:val="both"/>
       </w:pPr>
@@ -1429,7 +1122,7 @@
     </w:p>
     <w:p>
       <w:pPr>
-        <w:spacing w:after="160" w:line="360"/>
+        <w:spacing w:after="160" w:line="340"/>
         <w:jc w:val="both"/>
       </w:pPr>
       <w:r>
@@ -1447,7 +1140,7 @@
     </w:p>
     <w:p>
       <w:pPr>
-        <w:spacing w:after="160" w:line="360"/>
+        <w:spacing w:after="160" w:line="340"/>
         <w:jc w:val="both"/>
       </w:pPr>
       <w:r>
@@ -1465,7 +1158,7 @@
     </w:p>
     <w:p>
       <w:pPr>
-        <w:spacing w:after="160" w:line="360"/>
+        <w:spacing w:after="160" w:line="340"/>
         <w:jc w:val="both"/>
       </w:pPr>
       <w:r>
@@ -1522,7 +1215,7 @@
     </w:p>
     <w:p>
       <w:pPr>
-        <w:spacing w:after="160" w:line="360"/>
+        <w:spacing w:after="160" w:line="340"/>
         <w:jc w:val="both"/>
       </w:pPr>
       <w:r>
@@ -1540,7 +1233,7 @@
     </w:p>
     <w:p>
       <w:pPr>
-        <w:spacing w:after="160" w:line="360"/>
+        <w:spacing w:after="160" w:line="340"/>
         <w:jc w:val="both"/>
       </w:pPr>
       <w:r>
@@ -1580,7 +1273,7 @@
           <w:ilvl w:val="0"/>
           <w:numId w:val="2"/>
         </w:numPr>
-        <w:spacing w:after="100" w:line="360"/>
+        <w:spacing w:after="100" w:line="340"/>
       </w:pPr>
       <w:r>
         <w:rPr>
@@ -1598,7 +1291,7 @@
           <w:ilvl w:val="0"/>
           <w:numId w:val="2"/>
         </w:numPr>
-        <w:spacing w:after="100" w:line="360"/>
+        <w:spacing w:after="100" w:line="340"/>
       </w:pPr>
       <w:r>
         <w:rPr>
@@ -1616,7 +1309,7 @@
           <w:ilvl w:val="0"/>
           <w:numId w:val="2"/>
         </w:numPr>
-        <w:spacing w:after="100" w:line="360"/>
+        <w:spacing w:after="100" w:line="340"/>
       </w:pPr>
       <w:r>
         <w:rPr>
@@ -1646,7 +1339,7 @@
     </w:p>
     <w:p>
       <w:pPr>
-        <w:spacing w:after="160" w:line="360"/>
+        <w:spacing w:after="160" w:line="340"/>
         <w:jc w:val="both"/>
       </w:pPr>
       <w:r>
@@ -1664,7 +1357,7 @@
     </w:p>
     <w:p>
       <w:pPr>
-        <w:spacing w:after="160" w:line="360"/>
+        <w:spacing w:after="160" w:line="340"/>
         <w:jc w:val="both"/>
       </w:pPr>
       <w:r>
@@ -1699,20 +1392,55 @@
     </w:p>
     <w:p>
       <w:pPr>
-        <w:spacing w:after="160" w:line="360"/>
-        <w:jc w:val="both"/>
-      </w:pPr>
-      <w:r>
-        <w:rPr>
-          <w:rFonts w:ascii="Times New Roman" w:cs="Times New Roman" w:eastAsia="Times New Roman" w:hAnsi="Times New Roman"/>
-          <w:b w:val="false"/>
-          <w:bCs w:val="false"/>
-          <w:i w:val="false"/>
-          <w:iCs w:val="false"/>
-          <w:sz w:val="26"/>
-          <w:szCs w:val="26"/>
-        </w:rPr>
-        <w:t xml:space="preserve">Trước khi bắt tay vào cài đặt, nhóm có tìm hiểu qua các hướng giải bài toán liveness detection đang được dùng trong thực tế, để hiểu vị trí của giải pháp HOG + SVM so với các hướng khác:</w:t>
+        <w:spacing w:after="160" w:line="340"/>
+        <w:jc w:val="both"/>
+      </w:pPr>
+      <w:r>
+        <w:rPr>
+          <w:rFonts w:ascii="Times New Roman" w:cs="Times New Roman" w:eastAsia="Times New Roman" w:hAnsi="Times New Roman"/>
+          <w:b w:val="false"/>
+          <w:bCs w:val="false"/>
+          <w:i w:val="false"/>
+          <w:iCs w:val="false"/>
+          <w:sz w:val="26"/>
+          <w:szCs w:val="26"/>
+        </w:rPr>
+        <w:t xml:space="preserve">Trước khi cài đặt, nhóm tìm hiểu qua các hướng giải bài toán liveness detection đang dùng trong thực tế để xác định vị trí của giải pháp HOG + SVM: (1) Texture-based (hướng của nhóm) — dùng đặc trưng texture cổ điển như LBP/HOG để phát hiện khác biệt vân bề mặt giữa da thật và ảnh giả, nhẹ và nhanh trên CPU nhưng dễ bị đánh lừa bởi ảnh in chất lượng cao; (2) Motion-based — dựa vào chuyển động tự nhiên (chớp mắt, cử động đầu), cần xử lý theo chuỗi frame nên phức tạp hơn phạm vi đồ án; (3) Deep learning-based — dùng CNN học trực tiếp từ ảnh RGB/depth, chính xác hơn nhưng cần dữ liệu và tài nguyên lớn. Nhóm chọn hướng texture-based vì phù hợp kiến thức đã học, đủ nhẹ để chạy real-time trên máy cá nhân, và giải quyết đúng vấn đề cốt lõi ở mục 1.1.</w:t>
+      </w:r>
+    </w:p>
+    <w:p>
+      <w:pPr>
+        <w:pStyle w:val="Heading2"/>
+        <w:spacing w:after="160" w:before="260"/>
+      </w:pPr>
+      <w:r>
+        <w:rPr>
+          <w:rFonts w:ascii="Times New Roman" w:cs="Times New Roman" w:eastAsia="Times New Roman" w:hAnsi="Times New Roman"/>
+          <w:b/>
+          <w:bCs/>
+          <w:color w:val="2E5395"/>
+          <w:sz w:val="28"/>
+          <w:szCs w:val="28"/>
+        </w:rPr>
+        <w:t xml:space="preserve">1.5. Phương pháp tiếp cận và công cụ sử dụng</w:t>
+      </w:r>
+    </w:p>
+    <w:p>
+      <w:pPr>
+        <w:spacing w:after="160" w:line="340"/>
+        <w:jc w:val="both"/>
+      </w:pPr>
+      <w:r>
+        <w:rPr>
+          <w:rFonts w:ascii="Times New Roman" w:cs="Times New Roman" w:eastAsia="Times New Roman" w:hAnsi="Times New Roman"/>
+          <w:b w:val="false"/>
+          <w:bCs w:val="false"/>
+          <w:i w:val="false"/>
+          <w:iCs w:val="false"/>
+          <w:sz w:val="26"/>
+          <w:szCs w:val="26"/>
+        </w:rPr>
+        <w:t xml:space="preserve">Hệ thống được xây dựng dựa trên hướng tiếp cận Học máy (Machine Learning) kinh điển trong Thị giác máy tính. Thay vì tự phát triển các thuật toán toán học từ đầu, đồ án tập trung vào việc ứng dụng và tích hợp các thuật toán chuẩn mực đã có để giải quyết bài toán điểm danh và kiểm soát ra vào:</w:t>
       </w:r>
     </w:p>
     <w:p>
@@ -1722,15 +1450,15 @@
           <w:ilvl w:val="0"/>
           <w:numId w:val="1"/>
         </w:numPr>
-        <w:spacing w:after="100" w:line="360"/>
-      </w:pPr>
-      <w:r>
-        <w:rPr>
-          <w:rFonts w:ascii="Times New Roman" w:cs="Times New Roman" w:eastAsia="Times New Roman" w:hAnsi="Times New Roman"/>
-          <w:sz w:val="26"/>
-          <w:szCs w:val="26"/>
-        </w:rPr>
-        <w:t xml:space="preserve">Texture-based (giống hướng của nhóm): dùng các đặc trưng texture cổ điển như LBP (Local Binary Pattern) hoặc HOG để phát hiện sự khác biệt về vân bề mặt giữa da thật và ảnh in/màn hình. Ưu điểm là nhẹ, chạy nhanh trên CPU, không cần GPU; nhược điểm là dễ bị đánh lừa bởi ảnh in chất lượng rất cao.</w:t>
+        <w:spacing w:after="100" w:line="340"/>
+      </w:pPr>
+      <w:r>
+        <w:rPr>
+          <w:rFonts w:ascii="Times New Roman" w:cs="Times New Roman" w:eastAsia="Times New Roman" w:hAnsi="Times New Roman"/>
+          <w:sz w:val="26"/>
+          <w:szCs w:val="26"/>
+        </w:rPr>
+        <w:t xml:space="preserve">Phát hiện khuôn mặt (Face Detection): ứng dụng phương pháp Haar Cascade có sẵn trong thư viện OpenCV để xác định nhanh vị trí khuôn mặt trong ảnh.</w:t>
       </w:r>
     </w:p>
     <w:p>
@@ -1740,15 +1468,15 @@
           <w:ilvl w:val="0"/>
           <w:numId w:val="1"/>
         </w:numPr>
-        <w:spacing w:after="100" w:line="360"/>
-      </w:pPr>
-      <w:r>
-        <w:rPr>
-          <w:rFonts w:ascii="Times New Roman" w:cs="Times New Roman" w:eastAsia="Times New Roman" w:hAnsi="Times New Roman"/>
-          <w:sz w:val="26"/>
-          <w:szCs w:val="26"/>
-        </w:rPr>
-        <w:t xml:space="preserve">Motion-based: dựa vào các tín hiệu chuyển động tự nhiên như chớp mắt, cử động đầu, phản xạ ánh sáng thay đổi theo góc nhìn 3D. Nhóm không dùng hướng này vì cần xử lý theo chuỗi frame liên tiếp, phức tạp hơn phạm vi của đồ án.</w:t>
+        <w:spacing w:after="100" w:line="340"/>
+      </w:pPr>
+      <w:r>
+        <w:rPr>
+          <w:rFonts w:ascii="Times New Roman" w:cs="Times New Roman" w:eastAsia="Times New Roman" w:hAnsi="Times New Roman"/>
+          <w:sz w:val="26"/>
+          <w:szCs w:val="26"/>
+        </w:rPr>
+        <w:t xml:space="preserve">Trích xuất đặc trưng (Feature Extraction): xây dựng module tự động cắt ảnh, chuẩn hoá kích thước 64×64, rồi dùng thuật toán HOG (Histogram of Oriented Gradients) để chuyển ảnh khuôn mặt thành vector đặc trưng hình học.</w:t>
       </w:r>
     </w:p>
     <w:p>
@@ -1758,33 +1486,51 @@
           <w:ilvl w:val="0"/>
           <w:numId w:val="1"/>
         </w:numPr>
-        <w:spacing w:after="100" w:line="360"/>
-      </w:pPr>
-      <w:r>
-        <w:rPr>
-          <w:rFonts w:ascii="Times New Roman" w:cs="Times New Roman" w:eastAsia="Times New Roman" w:hAnsi="Times New Roman"/>
-          <w:sz w:val="26"/>
-          <w:szCs w:val="26"/>
-        </w:rPr>
-        <w:t xml:space="preserve">Deep learning-based: dùng CNN (ví dụ các mô hình dạng FaceNet, Anti-Spoofing CNN) học trực tiếp từ ảnh RGB hoặc ảnh hồng ngoại/depth. Độ chính xác thường cao hơn nhưng đòi hỏi dữ liệu lớn và tài nguyên tính toán mà nhóm không có trong phạm vi đồ án.</w:t>
-      </w:r>
-    </w:p>
-    <w:p>
-      <w:pPr>
-        <w:spacing w:after="160" w:line="360"/>
-        <w:jc w:val="both"/>
-      </w:pPr>
-      <w:r>
-        <w:rPr>
-          <w:rFonts w:ascii="Times New Roman" w:cs="Times New Roman" w:eastAsia="Times New Roman" w:hAnsi="Times New Roman"/>
-          <w:b w:val="false"/>
-          <w:bCs w:val="false"/>
-          <w:i w:val="false"/>
-          <w:iCs w:val="false"/>
-          <w:sz w:val="26"/>
-          <w:szCs w:val="26"/>
-        </w:rPr>
-        <w:t xml:space="preserve">Nhóm chọn hướng texture-based (HOG + SVM) vì phù hợp với kiến thức đã học, đủ nhẹ để chạy real-time trên máy cá nhân, và vẫn giải quyết được đúng vấn đề cốt lõi mà nhóm đặt ra ở mục 1.1.</w:t>
+        <w:spacing w:after="100" w:line="340"/>
+      </w:pPr>
+      <w:r>
+        <w:rPr>
+          <w:rFonts w:ascii="Times New Roman" w:cs="Times New Roman" w:eastAsia="Times New Roman" w:hAnsi="Times New Roman"/>
+          <w:sz w:val="26"/>
+          <w:szCs w:val="26"/>
+        </w:rPr>
+        <w:t xml:space="preserve">Phân loại (Classification): dùng thuật toán Máy vector hỗ trợ tuyến tính (LinearSVC) từ thư viện scikit-learn để huấn luyện hai mô hình độc lập — Nhận diện danh tính (Identity) và Phân biệt Thật/Giả (Liveness).</w:t>
+      </w:r>
+    </w:p>
+    <w:p>
+      <w:pPr>
+        <w:pStyle w:val="ListParagraph"/>
+        <w:numPr>
+          <w:ilvl w:val="0"/>
+          <w:numId w:val="1"/>
+        </w:numPr>
+        <w:spacing w:after="100" w:line="340"/>
+      </w:pPr>
+      <w:r>
+        <w:rPr>
+          <w:rFonts w:ascii="Times New Roman" w:cs="Times New Roman" w:eastAsia="Times New Roman" w:hAnsi="Times New Roman"/>
+          <w:sz w:val="26"/>
+          <w:szCs w:val="26"/>
+        </w:rPr>
+        <w:t xml:space="preserve">Giao diện (UI): xây dựng ứng dụng tương tác thời gian thực bằng framework Streamlit.</w:t>
+      </w:r>
+    </w:p>
+    <w:p>
+      <w:pPr>
+        <w:spacing w:after="160" w:line="340"/>
+        <w:jc w:val="both"/>
+      </w:pPr>
+      <w:r>
+        <w:rPr>
+          <w:rFonts w:ascii="Times New Roman" w:cs="Times New Roman" w:eastAsia="Times New Roman" w:hAnsi="Times New Roman"/>
+          <w:b w:val="false"/>
+          <w:bCs w:val="false"/>
+          <w:i w:val="false"/>
+          <w:iCs w:val="false"/>
+          <w:sz w:val="26"/>
+          <w:szCs w:val="26"/>
+        </w:rPr>
+        <w:t xml:space="preserve">Phần "nghiên cứu" của nhóm nằm ở việc lựa chọn, cấu hình tham số (kích thước cell/block, số bin, giá trị C...) và ghép các thành phần trên thành một pipeline hoàn chỉnh, chứ không phát minh thuật toán mới. Chương II trình bày lại cơ sở toán học để nhóm chứng minh hiểu và giải thích được các lựa chọn kỹ thuật trước hội đồng.</w:t>
       </w:r>
     </w:p>
     <w:p>
@@ -1823,7 +1569,7 @@
     </w:p>
     <w:p>
       <w:pPr>
-        <w:spacing w:after="160" w:line="360"/>
+        <w:spacing w:after="160" w:line="340"/>
         <w:jc w:val="both"/>
       </w:pPr>
       <w:r>
@@ -1841,7 +1587,7 @@
     </w:p>
     <w:p>
       <w:pPr>
-        <w:spacing w:after="160" w:line="360"/>
+        <w:spacing w:after="160" w:line="340"/>
         <w:jc w:val="center"/>
       </w:pPr>
       <w:r>
@@ -1859,7 +1605,7 @@
     </w:p>
     <w:p>
       <w:pPr>
-        <w:spacing w:after="160" w:line="360"/>
+        <w:spacing w:after="160" w:line="340"/>
         <w:jc w:val="both"/>
       </w:pPr>
       <w:r>
@@ -1877,7 +1623,7 @@
     </w:p>
     <w:p>
       <w:pPr>
-        <w:spacing w:after="160" w:line="360"/>
+        <w:spacing w:after="160" w:line="340"/>
         <w:jc w:val="center"/>
       </w:pPr>
       <w:r>
@@ -1895,7 +1641,7 @@
     </w:p>
     <w:p>
       <w:pPr>
-        <w:spacing w:after="160" w:line="360"/>
+        <w:spacing w:after="160" w:line="340"/>
         <w:jc w:val="both"/>
       </w:pPr>
       <w:r>
@@ -1930,7 +1676,7 @@
     </w:p>
     <w:p>
       <w:pPr>
-        <w:spacing w:after="160" w:line="360"/>
+        <w:spacing w:after="160" w:line="340"/>
         <w:jc w:val="both"/>
       </w:pPr>
       <w:r>
@@ -2217,7 +1963,7 @@
     </w:tbl>
     <w:p>
       <w:pPr>
-        <w:spacing w:after="160" w:line="360"/>
+        <w:spacing w:after="160" w:line="340"/>
         <w:jc w:val="both"/>
       </w:pPr>
       <w:r>
@@ -2235,7 +1981,7 @@
     </w:p>
     <w:p>
       <w:pPr>
-        <w:spacing w:after="160" w:line="360"/>
+        <w:spacing w:after="160" w:line="340"/>
         <w:jc w:val="both"/>
       </w:pPr>
       <w:r>
@@ -2253,7 +1999,7 @@
     </w:p>
     <w:p>
       <w:pPr>
-        <w:spacing w:after="160" w:line="360"/>
+        <w:spacing w:after="160" w:line="340"/>
         <w:jc w:val="both"/>
       </w:pPr>
       <w:r>
@@ -2288,7 +2034,7 @@
     </w:p>
     <w:p>
       <w:pPr>
-        <w:spacing w:after="160" w:line="360"/>
+        <w:spacing w:after="160" w:line="340"/>
         <w:jc w:val="both"/>
       </w:pPr>
       <w:r>
@@ -2311,7 +2057,7 @@
           <w:ilvl w:val="0"/>
           <w:numId w:val="2"/>
         </w:numPr>
-        <w:spacing w:after="100" w:line="360"/>
+        <w:spacing w:after="100" w:line="340"/>
       </w:pPr>
       <w:r>
         <w:rPr>
@@ -2329,7 +2075,7 @@
           <w:ilvl w:val="0"/>
           <w:numId w:val="2"/>
         </w:numPr>
-        <w:spacing w:after="100" w:line="360"/>
+        <w:spacing w:after="100" w:line="340"/>
       </w:pPr>
       <w:r>
         <w:rPr>
@@ -2347,7 +2093,7 @@
           <w:ilvl w:val="0"/>
           <w:numId w:val="2"/>
         </w:numPr>
-        <w:spacing w:after="100" w:line="360"/>
+        <w:spacing w:after="100" w:line="340"/>
       </w:pPr>
       <w:r>
         <w:rPr>
@@ -2360,7 +2106,7 @@
     </w:p>
     <w:p>
       <w:pPr>
-        <w:spacing w:after="160" w:line="360"/>
+        <w:spacing w:after="160" w:line="340"/>
         <w:jc w:val="both"/>
       </w:pPr>
       <w:r>
@@ -2378,20 +2124,20 @@
     </w:p>
     <w:p>
       <w:pPr>
-        <w:spacing w:after="160" w:line="360"/>
-        <w:jc w:val="both"/>
-      </w:pPr>
-      <w:r>
-        <w:rPr>
-          <w:rFonts w:ascii="Times New Roman" w:cs="Times New Roman" w:eastAsia="Times New Roman" w:hAnsi="Times New Roman"/>
-          <w:b w:val="false"/>
-          <w:bCs w:val="false"/>
-          <w:i w:val="false"/>
-          <w:iCs w:val="false"/>
-          <w:sz w:val="26"/>
-          <w:szCs w:val="26"/>
-        </w:rPr>
-        <w:t xml:space="preserve">Điểm đáng chú ý là HOG không chỉ dùng để nhận diện danh tính mà còn nhạy với sự khác biệt giữa da người thật và ảnh giả mạo: khi một khuôn mặt được hiển thị lại qua màn hình điện thoại hay laptop, các điểm ảnh trên màn hình tạo ra hiệu ứng vân Moiré và các vệt phản xạ ánh sáng (glare), làm lệch hẳn phân bố hướng gradient so với cấu trúc da và các nếp nhăn tự nhiên trên mặt người thật. Đây là cơ sở để nhóm dùng HOG cho cả bài toán liveness.</w:t>
+        <w:spacing w:after="160" w:line="340"/>
+        <w:jc w:val="both"/>
+      </w:pPr>
+      <w:r>
+        <w:rPr>
+          <w:rFonts w:ascii="Times New Roman" w:cs="Times New Roman" w:eastAsia="Times New Roman" w:hAnsi="Times New Roman"/>
+          <w:b w:val="false"/>
+          <w:bCs w:val="false"/>
+          <w:i w:val="false"/>
+          <w:iCs w:val="false"/>
+          <w:sz w:val="26"/>
+          <w:szCs w:val="26"/>
+        </w:rPr>
+        <w:t xml:space="preserve">Điểm đáng chú ý là HOG không chỉ dùng để nhận diện danh tính mà còn nhạy với sự khác biệt giữa da người thật và ảnh giả mạo: khi một khuôn mặt được hiển thị lại qua màn hình điện thoại hay laptop, hoặc bị in ra giấy, ảnh thường xuất hiện thêm nhiễu, mờ nhẹ, mất chi tiết hoặc các vệt phản xạ ánh sáng (glare), làm lệch phân bố hướng gradient so với cấu trúc da và các nếp nhăn tự nhiên trên mặt người thật. Đây là cơ sở lý thuyết để nhóm dùng HOG cho cả bài toán liveness, và cũng là các đặc điểm mà pipeline sinh dữ liệu giả mạo tổng hợp ở mục 4.2 chủ động mô phỏng lại trên ảnh thật.</w:t>
       </w:r>
     </w:p>
     <w:p>
@@ -2476,7 +2222,7 @@
     </w:p>
     <w:p>
       <w:pPr>
-        <w:spacing w:after="160" w:line="360"/>
+        <w:spacing w:after="160" w:line="340"/>
         <w:jc w:val="both"/>
       </w:pPr>
       <w:r>
@@ -2494,7 +2240,7 @@
     </w:p>
     <w:p>
       <w:pPr>
-        <w:spacing w:after="160" w:line="360"/>
+        <w:spacing w:after="160" w:line="340"/>
         <w:jc w:val="both"/>
       </w:pPr>
       <w:r>
@@ -2517,7 +2263,7 @@
           <w:ilvl w:val="0"/>
           <w:numId w:val="1"/>
         </w:numPr>
-        <w:spacing w:after="100" w:line="360"/>
+        <w:spacing w:after="100" w:line="340"/>
       </w:pPr>
       <w:r>
         <w:rPr>
@@ -2535,7 +2281,7 @@
           <w:ilvl w:val="0"/>
           <w:numId w:val="1"/>
         </w:numPr>
-        <w:spacing w:after="100" w:line="360"/>
+        <w:spacing w:after="100" w:line="340"/>
       </w:pPr>
       <w:r>
         <w:rPr>
@@ -2565,7 +2311,7 @@
     </w:p>
     <w:p>
       <w:pPr>
-        <w:spacing w:after="160" w:line="360"/>
+        <w:spacing w:after="160" w:line="340"/>
         <w:jc w:val="both"/>
       </w:pPr>
       <w:r>
@@ -2583,7 +2329,7 @@
     </w:p>
     <w:p>
       <w:pPr>
-        <w:spacing w:after="160" w:line="360"/>
+        <w:spacing w:after="160" w:line="340"/>
         <w:jc w:val="center"/>
       </w:pPr>
       <w:r>
@@ -2601,7 +2347,7 @@
     </w:p>
     <w:p>
       <w:pPr>
-        <w:spacing w:after="160" w:line="360"/>
+        <w:spacing w:after="160" w:line="340"/>
         <w:jc w:val="both"/>
       </w:pPr>
       <w:r>
@@ -2619,7 +2365,7 @@
     </w:p>
     <w:p>
       <w:pPr>
-        <w:spacing w:after="160" w:line="360"/>
+        <w:spacing w:after="160" w:line="340"/>
         <w:jc w:val="center"/>
       </w:pPr>
       <w:r>
@@ -2637,7 +2383,7 @@
     </w:p>
     <w:p>
       <w:pPr>
-        <w:spacing w:after="160" w:line="360"/>
+        <w:spacing w:after="160" w:line="340"/>
         <w:jc w:val="both"/>
       </w:pPr>
       <w:r>
@@ -2655,7 +2401,7 @@
     </w:p>
     <w:p>
       <w:pPr>
-        <w:spacing w:after="160" w:line="360"/>
+        <w:spacing w:after="160" w:line="340"/>
         <w:jc w:val="both"/>
       </w:pPr>
       <w:r>
@@ -2690,7 +2436,7 @@
     </w:p>
     <w:p>
       <w:pPr>
-        <w:spacing w:after="160" w:line="360"/>
+        <w:spacing w:after="160" w:line="340"/>
         <w:jc w:val="left"/>
       </w:pPr>
       <w:r>
@@ -2729,7 +2475,7 @@
           <w:ilvl w:val="0"/>
           <w:numId w:val="2"/>
         </w:numPr>
-        <w:spacing w:after="100" w:line="360"/>
+        <w:spacing w:after="100" w:line="340"/>
       </w:pPr>
       <w:r>
         <w:rPr>
@@ -2747,7 +2493,7 @@
           <w:ilvl w:val="0"/>
           <w:numId w:val="2"/>
         </w:numPr>
-        <w:spacing w:after="100" w:line="360"/>
+        <w:spacing w:after="100" w:line="340"/>
       </w:pPr>
       <w:r>
         <w:rPr>
@@ -2765,7 +2511,7 @@
           <w:ilvl w:val="0"/>
           <w:numId w:val="2"/>
         </w:numPr>
-        <w:spacing w:after="100" w:line="360"/>
+        <w:spacing w:after="100" w:line="340"/>
       </w:pPr>
       <w:r>
         <w:rPr>
@@ -2783,7 +2529,7 @@
           <w:ilvl w:val="0"/>
           <w:numId w:val="2"/>
         </w:numPr>
-        <w:spacing w:after="100" w:line="360"/>
+        <w:spacing w:after="100" w:line="340"/>
       </w:pPr>
       <w:r>
         <w:rPr>
@@ -2801,7 +2547,7 @@
           <w:ilvl w:val="0"/>
           <w:numId w:val="2"/>
         </w:numPr>
-        <w:spacing w:after="100" w:line="360"/>
+        <w:spacing w:after="100" w:line="340"/>
       </w:pPr>
       <w:r>
         <w:rPr>
@@ -2819,7 +2565,7 @@
           <w:ilvl w:val="1"/>
           <w:numId w:val="1"/>
         </w:numPr>
-        <w:spacing w:after="100" w:line="360"/>
+        <w:spacing w:after="100" w:line="340"/>
       </w:pPr>
       <w:r>
         <w:rPr>
@@ -2837,7 +2583,7 @@
           <w:ilvl w:val="1"/>
           <w:numId w:val="1"/>
         </w:numPr>
-        <w:spacing w:after="100" w:line="360"/>
+        <w:spacing w:after="100" w:line="340"/>
       </w:pPr>
       <w:r>
         <w:rPr>
@@ -2855,7 +2601,7 @@
           <w:ilvl w:val="0"/>
           <w:numId w:val="2"/>
         </w:numPr>
-        <w:spacing w:after="100" w:line="360"/>
+        <w:spacing w:after="100" w:line="340"/>
       </w:pPr>
       <w:r>
         <w:rPr>
@@ -3191,7 +2937,7 @@
     </w:tbl>
     <w:p>
       <w:pPr>
-        <w:spacing w:after="160" w:line="360"/>
+        <w:spacing w:after="160" w:line="340"/>
         <w:jc w:val="both"/>
       </w:pPr>
       <w:r>
@@ -3226,7 +2972,7 @@
     </w:p>
     <w:p>
       <w:pPr>
-        <w:spacing w:after="160" w:line="360"/>
+        <w:spacing w:after="160" w:line="340"/>
         <w:jc w:val="both"/>
       </w:pPr>
       <w:r>
@@ -3249,7 +2995,7 @@
           <w:ilvl w:val="0"/>
           <w:numId w:val="1"/>
         </w:numPr>
-        <w:spacing w:after="100" w:line="360"/>
+        <w:spacing w:after="100" w:line="340"/>
       </w:pPr>
       <w:r>
         <w:rPr>
@@ -3267,7 +3013,7 @@
           <w:ilvl w:val="0"/>
           <w:numId w:val="1"/>
         </w:numPr>
-        <w:spacing w:after="100" w:line="360"/>
+        <w:spacing w:after="100" w:line="340"/>
       </w:pPr>
       <w:r>
         <w:rPr>
@@ -3280,7 +3026,7 @@
     </w:p>
     <w:p>
       <w:pPr>
-        <w:spacing w:after="160" w:line="360"/>
+        <w:spacing w:after="160" w:line="340"/>
         <w:jc w:val="both"/>
       </w:pPr>
       <w:r>
@@ -3315,7 +3061,7 @@
     </w:p>
     <w:p>
       <w:pPr>
-        <w:spacing w:after="160" w:line="360"/>
+        <w:spacing w:after="160" w:line="340"/>
         <w:jc w:val="both"/>
       </w:pPr>
       <w:r>
@@ -3506,7 +3252,7 @@
     </w:tbl>
     <w:p>
       <w:pPr>
-        <w:spacing w:after="160" w:line="360"/>
+        <w:spacing w:after="160" w:line="340"/>
         <w:jc w:val="both"/>
       </w:pPr>
       <w:r>
@@ -3541,7 +3287,7 @@
     </w:p>
     <w:p>
       <w:pPr>
-        <w:spacing w:after="160" w:line="360"/>
+        <w:spacing w:after="160" w:line="340"/>
         <w:jc w:val="both"/>
       </w:pPr>
       <w:r>
@@ -3564,7 +3310,7 @@
           <w:ilvl w:val="0"/>
           <w:numId w:val="1"/>
         </w:numPr>
-        <w:spacing w:after="100" w:line="360"/>
+        <w:spacing w:after="100" w:line="340"/>
       </w:pPr>
       <w:r>
         <w:rPr>
@@ -3582,7 +3328,7 @@
           <w:ilvl w:val="0"/>
           <w:numId w:val="1"/>
         </w:numPr>
-        <w:spacing w:after="100" w:line="360"/>
+        <w:spacing w:after="100" w:line="340"/>
       </w:pPr>
       <w:r>
         <w:rPr>
@@ -3595,7 +3341,7 @@
     </w:p>
     <w:p>
       <w:pPr>
-        <w:spacing w:after="160" w:line="360"/>
+        <w:spacing w:after="160" w:line="340"/>
         <w:jc w:val="both"/>
       </w:pPr>
       <w:r>
@@ -3879,7 +3625,7 @@
     </w:tbl>
     <w:p>
       <w:pPr>
-        <w:spacing w:after="160" w:line="360"/>
+        <w:spacing w:after="160" w:line="340"/>
         <w:jc w:val="both"/>
       </w:pPr>
       <w:r>
@@ -4286,7 +4032,7 @@
     </w:tbl>
     <w:p>
       <w:pPr>
-        <w:spacing w:after="160" w:line="360"/>
+        <w:spacing w:after="160" w:line="340"/>
         <w:jc w:val="both"/>
       </w:pPr>
       <w:r>
@@ -4316,25 +4062,25 @@
           <w:sz w:val="28"/>
           <w:szCs w:val="28"/>
         </w:rPr>
-        <w:t xml:space="preserve">4.1. Thu thập dữ liệu</w:t>
-      </w:r>
-    </w:p>
-    <w:p>
-      <w:pPr>
-        <w:spacing w:after="160" w:line="360"/>
-        <w:jc w:val="both"/>
-      </w:pPr>
-      <w:r>
-        <w:rPr>
-          <w:rFonts w:ascii="Times New Roman" w:cs="Times New Roman" w:eastAsia="Times New Roman" w:hAnsi="Times New Roman"/>
-          <w:b w:val="false"/>
-          <w:bCs w:val="false"/>
-          <w:i w:val="false"/>
-          <w:iCs w:val="false"/>
-          <w:sz w:val="26"/>
-          <w:szCs w:val="26"/>
-        </w:rPr>
-        <w:t xml:space="preserve">Nhóm tự thu thập dữ liệu thay vì dùng dataset có sẵn, gồm hai nhóm:</w:t>
+        <w:t xml:space="preserve">4.2. Thu thập và xây dựng dữ liệu (Dataset Construction)</w:t>
+      </w:r>
+    </w:p>
+    <w:p>
+      <w:pPr>
+        <w:spacing w:after="160" w:line="340"/>
+        <w:jc w:val="both"/>
+      </w:pPr>
+      <w:r>
+        <w:rPr>
+          <w:rFonts w:ascii="Times New Roman" w:cs="Times New Roman" w:eastAsia="Times New Roman" w:hAnsi="Times New Roman"/>
+          <w:b w:val="false"/>
+          <w:bCs w:val="false"/>
+          <w:i w:val="false"/>
+          <w:iCs w:val="false"/>
+          <w:sz w:val="26"/>
+          <w:szCs w:val="26"/>
+        </w:rPr>
+        <w:t xml:space="preserve">Điểm nổi bật của hệ thống là bộ dữ liệu được nhóm tự thu thập và xây dựng hoàn toàn thủ công, không dùng dataset có sẵn, phù hợp với điều kiện thực tế của đồ án:</w:t>
       </w:r>
     </w:p>
     <w:p>
@@ -4344,15 +4090,15 @@
           <w:ilvl w:val="0"/>
           <w:numId w:val="1"/>
         </w:numPr>
-        <w:spacing w:after="100" w:line="360"/>
-      </w:pPr>
-      <w:r>
-        <w:rPr>
-          <w:rFonts w:ascii="Times New Roman" w:cs="Times New Roman" w:eastAsia="Times New Roman" w:hAnsi="Times New Roman"/>
-          <w:sz w:val="26"/>
-          <w:szCs w:val="26"/>
-        </w:rPr>
-        <w:t xml:space="preserve">Dữ liệu Positive (thật): ảnh khuôn mặt thật của Khải và Đức, chụp ở nhiều góc độ và điều kiện ánh sáng khác nhau.</w:t>
+        <w:spacing w:after="100" w:line="340"/>
+      </w:pPr>
+      <w:r>
+        <w:rPr>
+          <w:rFonts w:ascii="Times New Roman" w:cs="Times New Roman" w:eastAsia="Times New Roman" w:hAnsi="Times New Roman"/>
+          <w:sz w:val="26"/>
+          <w:szCs w:val="26"/>
+        </w:rPr>
+        <w:t xml:space="preserve">Dữ liệu danh tính (Positive): ảnh khuôn mặt thật của các cá nhân được cấp quyền thu thập (Khải, Đức), chụp trực tiếp từ camera ở nhiều góc độ và điều kiện ánh sáng khác nhau.</w:t>
       </w:r>
     </w:p>
     <w:p>
@@ -4362,20 +4108,56 @@
           <w:ilvl w:val="0"/>
           <w:numId w:val="1"/>
         </w:numPr>
-        <w:spacing w:after="100" w:line="360"/>
-      </w:pPr>
-      <w:r>
-        <w:rPr>
-          <w:rFonts w:ascii="Times New Roman" w:cs="Times New Roman" w:eastAsia="Times New Roman" w:hAnsi="Times New Roman"/>
-          <w:sz w:val="26"/>
-          <w:szCs w:val="26"/>
-        </w:rPr>
-        <w:t xml:space="preserve">Dữ liệu Negative/Spoof (giả mạo): ảnh khuôn mặt được chụp lại từ màn hình điện thoại hoặc laptop, nhằm tạo ra vân Moiré và vệt phản xạ ánh sáng đặc trưng của ảnh giả mạo.</w:t>
-      </w:r>
-    </w:p>
-    <w:p>
-      <w:pPr>
-        <w:spacing w:after="160" w:line="360"/>
+        <w:spacing w:after="100" w:line="340"/>
+      </w:pPr>
+      <w:r>
+        <w:rPr>
+          <w:rFonts w:ascii="Times New Roman" w:cs="Times New Roman" w:eastAsia="Times New Roman" w:hAnsi="Times New Roman"/>
+          <w:sz w:val="26"/>
+          <w:szCs w:val="26"/>
+        </w:rPr>
+        <w:t xml:space="preserve">Tăng cường dữ liệu (Data Augmentation): để giải quyết vấn đề thiếu hụt dữ liệu tự chụp, nhóm xây dựng thêm một bước sinh dữ liệu tự động, áp dụng lần lượt: lật ngang (flip), xoay nhẹ trong khoảng ±10 độ (rotate), và thay đổi độ sáng (brightness) trên mỗi ảnh gốc. Việc này giúp mở rộng bộ dữ liệu gấp khoảng 6 lần so với số ảnh chụp thật, giúp mô hình SVM học được nhiều góc mặt nghiêng và điều kiện ánh sáng khác nhau mà không cần chụp thêm quá nhiều ảnh thật.</w:t>
+      </w:r>
+    </w:p>
+    <w:p>
+      <w:pPr>
+        <w:pStyle w:val="ListParagraph"/>
+        <w:numPr>
+          <w:ilvl w:val="0"/>
+          <w:numId w:val="1"/>
+        </w:numPr>
+        <w:spacing w:after="100" w:line="340"/>
+      </w:pPr>
+      <w:r>
+        <w:rPr>
+          <w:rFonts w:ascii="Times New Roman" w:cs="Times New Roman" w:eastAsia="Times New Roman" w:hAnsi="Times New Roman"/>
+          <w:sz w:val="26"/>
+          <w:szCs w:val="26"/>
+        </w:rPr>
+        <w:t xml:space="preserve">Dữ liệu giả mạo (Liveness data): để mô hình học được các hình thức gian lận phổ biến (giơ ảnh in hoặc giơ màn hình điện thoại trước camera), nhóm xây dựng một pipeline tự động sinh ảnh giả mạo từ chính các ảnh khuôn mặt thật đã thu thập, thay vì phải chụp lại thủ công từng ảnh qua từng thiết bị. Cụ thể, ảnh thật được xử lý theo hai hướng: (1) thêm nhiễu (noise), làm mờ nhẹ (blur) và giảm độ bão hòa màu để mô phỏng đặc điểm của ảnh in giấy; (2) thêm vệt sáng cục bộ và viền tối (vignette) để mô phỏng hiệu ứng phản xạ và giới hạn khung hình khi ảnh bị chụp lại từ màn hình điện thoại hoặc laptop.</w:t>
+      </w:r>
+    </w:p>
+    <w:p>
+      <w:pPr>
+        <w:spacing w:after="160" w:line="340"/>
+        <w:jc w:val="both"/>
+      </w:pPr>
+      <w:r>
+        <w:rPr>
+          <w:rFonts w:ascii="Times New Roman" w:cs="Times New Roman" w:eastAsia="Times New Roman" w:hAnsi="Times New Roman"/>
+          <w:b w:val="false"/>
+          <w:bCs w:val="false"/>
+          <w:i w:val="false"/>
+          <w:iCs w:val="false"/>
+          <w:sz w:val="26"/>
+          <w:szCs w:val="26"/>
+        </w:rPr>
+        <w:t xml:space="preserve">So với chụp lại thủ công qua từng thiết bị, pipeline tự động này giúp tạo ra nhiều mẫu Spoof đa dạng hơn trong cùng thời gian, vẫn giữ đúng các đặc điểm (nhiễu, mờ, mất chi tiết, vệt sáng) mà mục 2.2 chỉ ra là làm lệch phân bố hướng gradient so với da thật. Ở bước kiểm thử thực tế (mục 4.6), nhóm vẫn thử giơ ảnh in/màn hình điện thoại trực tiếp trước camera để đối chiếu với dữ liệu huấn luyện tổng hợp.</w:t>
+      </w:r>
+    </w:p>
+    <w:p>
+      <w:pPr>
+        <w:spacing w:after="160" w:line="340"/>
         <w:jc w:val="left"/>
       </w:pPr>
       <w:r>
@@ -4387,7 +4169,7 @@
           <w:sz w:val="26"/>
           <w:szCs w:val="26"/>
         </w:rPr>
-        <w:t xml:space="preserve">[Điền số lượng ảnh thực tế đã thu thập cho mỗi lớp, ví dụ: Khải – 300 ảnh, Đức – 300 ảnh, Spoof – 300 ảnh, và tỉ lệ chia train/test, ví dụ 80/20]</w:t>
+        <w:t xml:space="preserve">[Điền số lượng ảnh gốc thu thập cho mỗi lớp trước augmentation (ví dụ: Khải – 100 ảnh gốc, Đức – 100 ảnh gốc), số lượng sau khi tăng cường dữ liệu (x6), số lượng ảnh Spoof tổng hợp được sinh ra, và tỉ lệ chia train/test, ví dụ 80/20]</w:t>
       </w:r>
     </w:p>
     <w:p>
@@ -4404,12 +4186,12 @@
           <w:sz w:val="28"/>
           <w:szCs w:val="28"/>
         </w:rPr>
-        <w:t xml:space="preserve">4.2. Tiền xử lý dữ liệu</w:t>
-      </w:r>
-    </w:p>
-    <w:p>
-      <w:pPr>
-        <w:spacing w:after="160" w:line="360"/>
+        <w:t xml:space="preserve">4.3. Tiền xử lý dữ liệu</w:t>
+      </w:r>
+    </w:p>
+    <w:p>
+      <w:pPr>
+        <w:spacing w:after="160" w:line="340"/>
         <w:jc w:val="both"/>
       </w:pPr>
       <w:r>
@@ -4439,12 +4221,12 @@
           <w:sz w:val="28"/>
           <w:szCs w:val="28"/>
         </w:rPr>
-        <w:t xml:space="preserve">4.3. Thiết lập huấn luyện SVM</w:t>
-      </w:r>
-    </w:p>
-    <w:p>
-      <w:pPr>
-        <w:spacing w:after="160" w:line="360"/>
+        <w:t xml:space="preserve">4.4. Thiết lập huấn luyện SVM</w:t>
+      </w:r>
+    </w:p>
+    <w:p>
+      <w:pPr>
+        <w:spacing w:after="160" w:line="340"/>
         <w:jc w:val="both"/>
       </w:pPr>
       <w:r>
@@ -4898,7 +4680,7 @@
     </w:tbl>
     <w:p>
       <w:pPr>
-        <w:spacing w:after="160" w:line="360"/>
+        <w:spacing w:after="160" w:line="340"/>
         <w:jc w:val="left"/>
       </w:pPr>
       <w:r>
@@ -4915,7 +4697,7 @@
     </w:p>
     <w:p>
       <w:pPr>
-        <w:spacing w:after="160" w:line="360"/>
+        <w:spacing w:after="160" w:line="340"/>
         <w:jc w:val="both"/>
       </w:pPr>
       <w:r>
@@ -4945,12 +4727,12 @@
           <w:sz w:val="28"/>
           <w:szCs w:val="28"/>
         </w:rPr>
-        <w:t xml:space="preserve">4.4. Cải tiến độ nhạy phát hiện khuôn mặt</w:t>
-      </w:r>
-    </w:p>
-    <w:p>
-      <w:pPr>
-        <w:spacing w:after="160" w:line="360"/>
+        <w:t xml:space="preserve">4.5. Cải tiến độ nhạy phát hiện khuôn mặt</w:t>
+      </w:r>
+    </w:p>
+    <w:p>
+      <w:pPr>
+        <w:spacing w:after="160" w:line="340"/>
         <w:jc w:val="both"/>
       </w:pPr>
       <w:r>
@@ -4973,7 +4755,7 @@
           <w:ilvl w:val="0"/>
           <w:numId w:val="2"/>
         </w:numPr>
-        <w:spacing w:after="100" w:line="360"/>
+        <w:spacing w:after="100" w:line="340"/>
       </w:pPr>
       <w:r>
         <w:rPr>
@@ -4991,7 +4773,7 @@
           <w:ilvl w:val="0"/>
           <w:numId w:val="2"/>
         </w:numPr>
-        <w:spacing w:after="100" w:line="360"/>
+        <w:spacing w:after="100" w:line="340"/>
       </w:pPr>
       <w:r>
         <w:rPr>
@@ -5440,7 +5222,7 @@
     </w:tbl>
     <w:p>
       <w:pPr>
-        <w:spacing w:after="160" w:line="360"/>
+        <w:spacing w:after="160" w:line="340"/>
         <w:jc w:val="left"/>
       </w:pPr>
       <w:r>
@@ -5457,7 +5239,7 @@
     </w:p>
     <w:p>
       <w:pPr>
-        <w:spacing w:after="160" w:line="360"/>
+        <w:spacing w:after="160" w:line="340"/>
         <w:jc w:val="both"/>
       </w:pPr>
       <w:r>
@@ -5492,7 +5274,7 @@
     </w:p>
     <w:p>
       <w:pPr>
-        <w:spacing w:after="160" w:line="360"/>
+        <w:spacing w:after="160" w:line="340"/>
         <w:jc w:val="both"/>
       </w:pPr>
       <w:r>
@@ -5515,7 +5297,7 @@
           <w:ilvl w:val="0"/>
           <w:numId w:val="2"/>
         </w:numPr>
-        <w:spacing w:after="100" w:line="360"/>
+        <w:spacing w:after="100" w:line="340"/>
       </w:pPr>
       <w:r>
         <w:rPr>
@@ -5533,7 +5315,7 @@
           <w:ilvl w:val="0"/>
           <w:numId w:val="2"/>
         </w:numPr>
-        <w:spacing w:after="100" w:line="360"/>
+        <w:spacing w:after="100" w:line="340"/>
       </w:pPr>
       <w:r>
         <w:rPr>
@@ -5551,7 +5333,7 @@
           <w:ilvl w:val="0"/>
           <w:numId w:val="2"/>
         </w:numPr>
-        <w:spacing w:after="100" w:line="360"/>
+        <w:spacing w:after="100" w:line="340"/>
       </w:pPr>
       <w:r>
         <w:rPr>
@@ -5569,7 +5351,7 @@
           <w:ilvl w:val="0"/>
           <w:numId w:val="2"/>
         </w:numPr>
-        <w:spacing w:after="100" w:line="360"/>
+        <w:spacing w:after="100" w:line="340"/>
       </w:pPr>
       <w:r>
         <w:rPr>
@@ -5587,7 +5369,7 @@
           <w:ilvl w:val="0"/>
           <w:numId w:val="2"/>
         </w:numPr>
-        <w:spacing w:after="100" w:line="360"/>
+        <w:spacing w:after="100" w:line="340"/>
       </w:pPr>
       <w:r>
         <w:rPr>
@@ -5600,7 +5382,7 @@
     </w:p>
     <w:p>
       <w:pPr>
-        <w:spacing w:after="160" w:line="360"/>
+        <w:spacing w:after="160" w:line="340"/>
         <w:jc w:val="left"/>
       </w:pPr>
       <w:r>
@@ -6114,7 +5896,7 @@
     </w:tbl>
     <w:p>
       <w:pPr>
-        <w:spacing w:after="160" w:line="360"/>
+        <w:spacing w:after="160" w:line="340"/>
         <w:jc w:val="left"/>
       </w:pPr>
       <w:r>
@@ -6564,7 +6346,7 @@
     </w:tbl>
     <w:p>
       <w:pPr>
-        <w:spacing w:after="160" w:line="360"/>
+        <w:spacing w:after="160" w:line="340"/>
         <w:jc w:val="left"/>
       </w:pPr>
       <w:r>
@@ -6598,7 +6380,7 @@
     </w:p>
     <w:p>
       <w:pPr>
-        <w:spacing w:after="160" w:line="360"/>
+        <w:spacing w:after="160" w:line="340"/>
         <w:jc w:val="both"/>
       </w:pPr>
       <w:r>
@@ -7027,7 +6809,7 @@
     </w:tbl>
     <w:p>
       <w:pPr>
-        <w:spacing w:after="160" w:line="360"/>
+        <w:spacing w:after="160" w:line="340"/>
         <w:jc w:val="left"/>
       </w:pPr>
       <w:r>
@@ -7061,7 +6843,7 @@
     </w:p>
     <w:p>
       <w:pPr>
-        <w:spacing w:after="160" w:line="360"/>
+        <w:spacing w:after="160" w:line="340"/>
         <w:jc w:val="both"/>
       </w:pPr>
       <w:r>
@@ -7084,7 +6866,7 @@
           <w:ilvl w:val="0"/>
           <w:numId w:val="1"/>
         </w:numPr>
-        <w:spacing w:after="100" w:line="360"/>
+        <w:spacing w:after="100" w:line="340"/>
       </w:pPr>
       <w:r>
         <w:rPr>
@@ -7102,7 +6884,7 @@
           <w:ilvl w:val="0"/>
           <w:numId w:val="1"/>
         </w:numPr>
-        <w:spacing w:after="100" w:line="360"/>
+        <w:spacing w:after="100" w:line="340"/>
       </w:pPr>
       <w:r>
         <w:rPr>
@@ -7120,7 +6902,7 @@
           <w:ilvl w:val="0"/>
           <w:numId w:val="1"/>
         </w:numPr>
-        <w:spacing w:after="100" w:line="360"/>
+        <w:spacing w:after="100" w:line="340"/>
       </w:pPr>
       <w:r>
         <w:rPr>
@@ -7133,7 +6915,7 @@
     </w:p>
     <w:p>
       <w:pPr>
-        <w:spacing w:after="160" w:line="360"/>
+        <w:spacing w:after="160" w:line="340"/>
         <w:jc w:val="left"/>
       </w:pPr>
       <w:r>
@@ -7189,7 +6971,7 @@
           <w:ilvl w:val="0"/>
           <w:numId w:val="1"/>
         </w:numPr>
-        <w:spacing w:after="100" w:line="360"/>
+        <w:spacing w:after="100" w:line="340"/>
       </w:pPr>
       <w:r>
         <w:rPr>
@@ -7207,7 +6989,7 @@
           <w:ilvl w:val="0"/>
           <w:numId w:val="1"/>
         </w:numPr>
-        <w:spacing w:after="100" w:line="360"/>
+        <w:spacing w:after="100" w:line="340"/>
       </w:pPr>
       <w:r>
         <w:rPr>
@@ -7225,7 +7007,7 @@
           <w:ilvl w:val="0"/>
           <w:numId w:val="1"/>
         </w:numPr>
-        <w:spacing w:after="100" w:line="360"/>
+        <w:spacing w:after="100" w:line="340"/>
       </w:pPr>
       <w:r>
         <w:rPr>
@@ -7260,7 +7042,7 @@
           <w:ilvl w:val="0"/>
           <w:numId w:val="1"/>
         </w:numPr>
-        <w:spacing w:after="100" w:line="360"/>
+        <w:spacing w:after="100" w:line="340"/>
       </w:pPr>
       <w:r>
         <w:rPr>
@@ -7278,7 +7060,7 @@
           <w:ilvl w:val="0"/>
           <w:numId w:val="1"/>
         </w:numPr>
-        <w:spacing w:after="100" w:line="360"/>
+        <w:spacing w:after="100" w:line="340"/>
       </w:pPr>
       <w:r>
         <w:rPr>
@@ -7296,7 +7078,25 @@
           <w:ilvl w:val="0"/>
           <w:numId w:val="1"/>
         </w:numPr>
-        <w:spacing w:after="100" w:line="360"/>
+        <w:spacing w:after="100" w:line="340"/>
+      </w:pPr>
+      <w:r>
+        <w:rPr>
+          <w:rFonts w:ascii="Times New Roman" w:cs="Times New Roman" w:eastAsia="Times New Roman" w:hAnsi="Times New Roman"/>
+          <w:sz w:val="26"/>
+          <w:szCs w:val="26"/>
+        </w:rPr>
+        <w:t xml:space="preserve">Dữ liệu Spoof phần lớn được sinh tổng hợp bằng cách thêm nhiễu/mờ/vignette lên ảnh thật (mục 4.2), nên vẫn có khoảng cách (domain gap) so với ảnh chụp lại thật ngoài đời; đây cũng là lý do nhóm giữ lại bước kiểm thử trực tiếp bằng ảnh in/màn hình thật ở mục 4.6 để đối chiếu.</w:t>
+      </w:r>
+    </w:p>
+    <w:p>
+      <w:pPr>
+        <w:pStyle w:val="ListParagraph"/>
+        <w:numPr>
+          <w:ilvl w:val="0"/>
+          <w:numId w:val="1"/>
+        </w:numPr>
+        <w:spacing w:after="100" w:line="340"/>
       </w:pPr>
       <w:r>
         <w:rPr>
@@ -7331,7 +7131,7 @@
           <w:ilvl w:val="0"/>
           <w:numId w:val="1"/>
         </w:numPr>
-        <w:spacing w:after="100" w:line="360"/>
+        <w:spacing w:after="100" w:line="340"/>
       </w:pPr>
       <w:r>
         <w:rPr>
@@ -7349,7 +7149,7 @@
           <w:ilvl w:val="0"/>
           <w:numId w:val="1"/>
         </w:numPr>
-        <w:spacing w:after="100" w:line="360"/>
+        <w:spacing w:after="100" w:line="340"/>
       </w:pPr>
       <w:r>
         <w:rPr>
@@ -7367,7 +7167,7 @@
           <w:ilvl w:val="0"/>
           <w:numId w:val="1"/>
         </w:numPr>
-        <w:spacing w:after="100" w:line="360"/>
+        <w:spacing w:after="100" w:line="340"/>
       </w:pPr>
       <w:r>
         <w:rPr>
@@ -7385,7 +7185,7 @@
           <w:ilvl w:val="0"/>
           <w:numId w:val="1"/>
         </w:numPr>
-        <w:spacing w:after="100" w:line="360"/>
+        <w:spacing w:after="100" w:line="340"/>
       </w:pPr>
       <w:r>
         <w:rPr>
@@ -7403,7 +7203,7 @@
           <w:ilvl w:val="0"/>
           <w:numId w:val="1"/>
         </w:numPr>
-        <w:spacing w:after="100" w:line="360"/>
+        <w:spacing w:after="100" w:line="340"/>
       </w:pPr>
       <w:r>
         <w:rPr>
@@ -7433,38 +7233,20 @@
     </w:p>
     <w:p>
       <w:pPr>
-        <w:spacing w:after="160" w:line="360"/>
-        <w:jc w:val="both"/>
-      </w:pPr>
-      <w:r>
-        <w:rPr>
-          <w:rFonts w:ascii="Times New Roman" w:cs="Times New Roman" w:eastAsia="Times New Roman" w:hAnsi="Times New Roman"/>
-          <w:b w:val="false"/>
-          <w:bCs w:val="false"/>
-          <w:i w:val="false"/>
-          <w:iCs w:val="false"/>
-          <w:sz w:val="26"/>
-          <w:szCs w:val="26"/>
-        </w:rPr>
-        <w:t xml:space="preserve">Qua đồ án này, nhóm đã đi từ lý thuyết Image Gradient, HOG và SVM được học trên lớp đến một ứng dụng demo chạy được thật, xử lý cả ảnh tĩnh và video thời gian thực. Việc mở rộng đề tài sang bài toán Anti-Spoofing giúp nhóm hiểu rằng HOG không chỉ là công cụ mô tả hình dạng cho nhận diện đối tượng, mà còn có thể khai thác để phát hiện những khác biệt rất nhỏ về texture giữa da thật và bề mặt hiển thị lại qua thiết bị.</w:t>
-      </w:r>
-    </w:p>
-    <w:p>
-      <w:pPr>
-        <w:spacing w:after="160" w:line="360"/>
-        <w:jc w:val="both"/>
-      </w:pPr>
-      <w:r>
-        <w:rPr>
-          <w:rFonts w:ascii="Times New Roman" w:cs="Times New Roman" w:eastAsia="Times New Roman" w:hAnsi="Times New Roman"/>
-          <w:b w:val="false"/>
-          <w:bCs w:val="false"/>
-          <w:i w:val="false"/>
-          <w:iCs w:val="false"/>
-          <w:sz w:val="26"/>
-          <w:szCs w:val="26"/>
-        </w:rPr>
-        <w:t xml:space="preserve">Nhóm cũng hiểu rõ hơn giới hạn của một giải pháp học máy cổ điển như SVM so với các hướng deep learning hiện đại: đủ nhẹ và nhanh để chạy real-time trên máy cá nhân, nhưng cần dữ liệu được thiết kế và tiền xử lý kỹ mới đạt được độ chính xác tốt, và dễ bị đánh lừa bởi các kiểu giả mạo mà đặc trưng HOG không nắm bắt được (ví dụ ảnh in không phản xạ sáng). Đây cũng chính là cơ sở cho các hướng phát triển đã đề xuất ở mục 6.3.</w:t>
+        <w:spacing w:after="160" w:line="340"/>
+        <w:jc w:val="both"/>
+      </w:pPr>
+      <w:r>
+        <w:rPr>
+          <w:rFonts w:ascii="Times New Roman" w:cs="Times New Roman" w:eastAsia="Times New Roman" w:hAnsi="Times New Roman"/>
+          <w:b w:val="false"/>
+          <w:bCs w:val="false"/>
+          <w:i w:val="false"/>
+          <w:iCs w:val="false"/>
+          <w:sz w:val="26"/>
+          <w:szCs w:val="26"/>
+        </w:rPr>
+        <w:t xml:space="preserve">Qua đồ án này, nhóm đã đi từ lý thuyết Image Gradient, HOG và SVM được học trên lớp đến một ứng dụng demo chạy được thật, xử lý cả ảnh tĩnh và video thời gian thực, đồng thời hiểu rõ hơn giới hạn của một giải pháp học máy cổ điển so với các hướng deep learning hiện đại: đủ nhẹ và nhanh để chạy real-time trên máy cá nhân, nhưng cần dữ liệu được thiết kế và tiền xử lý kỹ, và vẫn có thể bị đánh lừa bởi các kiểu giả mạo mà đặc trưng HOG không nắm bắt được — đây cũng là cơ sở cho các hướng phát triển đã đề xuất ở mục 6.3.</w:t>
       </w:r>
     </w:p>
     <w:p>
@@ -7491,7 +7273,7 @@
           <w:ilvl w:val="0"/>
           <w:numId w:val="1"/>
         </w:numPr>
-        <w:spacing w:after="100" w:line="360"/>
+        <w:spacing w:after="100" w:line="340"/>
       </w:pPr>
       <w:r>
         <w:rPr>
@@ -7509,7 +7291,7 @@
           <w:ilvl w:val="0"/>
           <w:numId w:val="1"/>
         </w:numPr>
-        <w:spacing w:after="100" w:line="360"/>
+        <w:spacing w:after="100" w:line="340"/>
       </w:pPr>
       <w:r>
         <w:rPr>
@@ -7591,7 +7373,7 @@
                 <w:sz w:val="20"/>
                 <w:szCs w:val="20"/>
               </w:rPr>
-              <w:t xml:space="preserve">import cv2, numpy as np, os</w:t>
+              <w:t xml:space="preserve">face_cascade = cv2.CascadeClassifier(</w:t>
             </w:r>
           </w:p>
           <w:p>
@@ -7604,7 +7386,7 @@
                 <w:sz w:val="20"/>
                 <w:szCs w:val="20"/>
               </w:rPr>
-              <w:t xml:space="preserve">from hog_extractor import extract_hog</w:t>
+              <w:t xml:space="preserve">    cv2.data.haarcascades + 'haarcascade_frontalface_default.xml')</w:t>
             </w:r>
           </w:p>
           <w:p>
@@ -7617,7 +7399,7 @@
                 <w:sz w:val="20"/>
                 <w:szCs w:val="20"/>
               </w:rPr>
-              <w:t xml:space="preserve"/>
+              <w:t xml:space="preserve">def preprocess_image(path):</w:t>
             </w:r>
           </w:p>
           <w:p>
@@ -7630,7 +7412,7 @@
                 <w:sz w:val="20"/>
                 <w:szCs w:val="20"/>
               </w:rPr>
-              <w:t xml:space="preserve">face_cascade = cv2.CascadeClassifier(</w:t>
+              <w:t xml:space="preserve">    img = cv2.imread(path)</w:t>
             </w:r>
           </w:p>
           <w:p>
@@ -7643,7 +7425,7 @@
                 <w:sz w:val="20"/>
                 <w:szCs w:val="20"/>
               </w:rPr>
-              <w:t xml:space="preserve">    cv2.data.haarcascades + 'haarcascade_frontalface_default.xml')</w:t>
+              <w:t xml:space="preserve">    gray = cv2.equalizeHist(cv2.cvtColor(img, cv2.COLOR_BGR2GRAY))</w:t>
             </w:r>
           </w:p>
           <w:p>
@@ -7656,7 +7438,7 @@
                 <w:sz w:val="20"/>
                 <w:szCs w:val="20"/>
               </w:rPr>
-              <w:t xml:space="preserve"/>
+              <w:t xml:space="preserve">    faces = face_cascade.detectMultiScale(gray, scaleFactor=1.05, minNeighbors=3)</w:t>
             </w:r>
           </w:p>
           <w:p>
@@ -7669,7 +7451,7 @@
                 <w:sz w:val="20"/>
                 <w:szCs w:val="20"/>
               </w:rPr>
-              <w:t xml:space="preserve">def preprocess_image(path):</w:t>
+              <w:t xml:space="preserve">    return [extract_hog(cv2.resize(gray[y:y+h, x:x+w], (64, 64)))</w:t>
             </w:r>
           </w:p>
           <w:p>
@@ -7682,124 +7464,7 @@
                 <w:sz w:val="20"/>
                 <w:szCs w:val="20"/>
               </w:rPr>
-              <w:t xml:space="preserve">    img = cv2.imread(path)</w:t>
-            </w:r>
-          </w:p>
-          <w:p>
-            <w:pPr>
-              <w:spacing w:after="40"/>
-            </w:pPr>
-            <w:r>
-              <w:rPr>
-                <w:rFonts w:ascii="Consolas" w:cs="Consolas" w:eastAsia="Consolas" w:hAnsi="Consolas"/>
-                <w:sz w:val="20"/>
-                <w:szCs w:val="20"/>
-              </w:rPr>
-              <w:t xml:space="preserve">    gray = cv2.cvtColor(img, cv2.COLOR_BGR2GRAY)</w:t>
-            </w:r>
-          </w:p>
-          <w:p>
-            <w:pPr>
-              <w:spacing w:after="40"/>
-            </w:pPr>
-            <w:r>
-              <w:rPr>
-                <w:rFonts w:ascii="Consolas" w:cs="Consolas" w:eastAsia="Consolas" w:hAnsi="Consolas"/>
-                <w:sz w:val="20"/>
-                <w:szCs w:val="20"/>
-              </w:rPr>
-              <w:t xml:space="preserve">    gray = cv2.equalizeHist(gray)          # tăng độ nhạy Haar Cascade</w:t>
-            </w:r>
-          </w:p>
-          <w:p>
-            <w:pPr>
-              <w:spacing w:after="40"/>
-            </w:pPr>
-            <w:r>
-              <w:rPr>
-                <w:rFonts w:ascii="Consolas" w:cs="Consolas" w:eastAsia="Consolas" w:hAnsi="Consolas"/>
-                <w:sz w:val="20"/>
-                <w:szCs w:val="20"/>
-              </w:rPr>
-              <w:t xml:space="preserve">    faces = face_cascade.detectMultiScale(</w:t>
-            </w:r>
-          </w:p>
-          <w:p>
-            <w:pPr>
-              <w:spacing w:after="40"/>
-            </w:pPr>
-            <w:r>
-              <w:rPr>
-                <w:rFonts w:ascii="Consolas" w:cs="Consolas" w:eastAsia="Consolas" w:hAnsi="Consolas"/>
-                <w:sz w:val="20"/>
-                <w:szCs w:val="20"/>
-              </w:rPr>
-              <w:t xml:space="preserve">        gray, scaleFactor=1.05, minNeighbors=3)</w:t>
-            </w:r>
-          </w:p>
-          <w:p>
-            <w:pPr>
-              <w:spacing w:after="40"/>
-            </w:pPr>
-            <w:r>
-              <w:rPr>
-                <w:rFonts w:ascii="Consolas" w:cs="Consolas" w:eastAsia="Consolas" w:hAnsi="Consolas"/>
-                <w:sz w:val="20"/>
-                <w:szCs w:val="20"/>
-              </w:rPr>
-              <w:t xml:space="preserve">    vectors = []</w:t>
-            </w:r>
-          </w:p>
-          <w:p>
-            <w:pPr>
-              <w:spacing w:after="40"/>
-            </w:pPr>
-            <w:r>
-              <w:rPr>
-                <w:rFonts w:ascii="Consolas" w:cs="Consolas" w:eastAsia="Consolas" w:hAnsi="Consolas"/>
-                <w:sz w:val="20"/>
-                <w:szCs w:val="20"/>
-              </w:rPr>
-              <w:t xml:space="preserve">    for (x, y, w, h) in faces:</w:t>
-            </w:r>
-          </w:p>
-          <w:p>
-            <w:pPr>
-              <w:spacing w:after="40"/>
-            </w:pPr>
-            <w:r>
-              <w:rPr>
-                <w:rFonts w:ascii="Consolas" w:cs="Consolas" w:eastAsia="Consolas" w:hAnsi="Consolas"/>
-                <w:sz w:val="20"/>
-                <w:szCs w:val="20"/>
-              </w:rPr>
-              <w:t xml:space="preserve">        roi = cv2.resize(gray[y:y+h, x:x+w], (64, 64))</w:t>
-            </w:r>
-          </w:p>
-          <w:p>
-            <w:pPr>
-              <w:spacing w:after="40"/>
-            </w:pPr>
-            <w:r>
-              <w:rPr>
-                <w:rFonts w:ascii="Consolas" w:cs="Consolas" w:eastAsia="Consolas" w:hAnsi="Consolas"/>
-                <w:sz w:val="20"/>
-                <w:szCs w:val="20"/>
-              </w:rPr>
-              <w:t xml:space="preserve">        vectors.append(extract_hog(roi))</w:t>
-            </w:r>
-          </w:p>
-          <w:p>
-            <w:pPr>
-              <w:spacing w:after="40"/>
-            </w:pPr>
-            <w:r>
-              <w:rPr>
-                <w:rFonts w:ascii="Consolas" w:cs="Consolas" w:eastAsia="Consolas" w:hAnsi="Consolas"/>
-                <w:sz w:val="20"/>
-                <w:szCs w:val="20"/>
-              </w:rPr>
-              <w:t xml:space="preserve">    return vectors</w:t>
+              <w:t xml:space="preserve">            for (x, y, w, h) in faces]</w:t>
             </w:r>
           </w:p>
         </w:tc>
@@ -7819,7 +7484,7 @@
           <w:sz w:val="28"/>
           <w:szCs w:val="28"/>
         </w:rPr>
-        <w:t xml:space="preserve">B.2. Huấn luyện SVM (train_svm.py)</w:t>
+        <w:t xml:space="preserve">B.2. Tăng cường dữ liệu và sinh ảnh giả mạo tổng hợp (augment.py)</w:t>
       </w:r>
     </w:p>
     <w:tbl>
@@ -7859,7 +7524,7 @@
                 <w:sz w:val="20"/>
                 <w:szCs w:val="20"/>
               </w:rPr>
-              <w:t xml:space="preserve">from sklearn.svm import LinearSVC</w:t>
+              <w:t xml:space="preserve">def augment_real(img):</w:t>
             </w:r>
           </w:p>
           <w:p>
@@ -7872,7 +7537,7 @@
                 <w:sz w:val="20"/>
                 <w:szCs w:val="20"/>
               </w:rPr>
-              <w:t xml:space="preserve">from sklearn.model_selection import train_test_split</w:t>
+              <w:t xml:space="preserve">    outs = [img, cv2.flip(img, 1)]                # lật ngang</w:t>
             </w:r>
           </w:p>
           <w:p>
@@ -7885,7 +7550,7 @@
                 <w:sz w:val="20"/>
                 <w:szCs w:val="20"/>
               </w:rPr>
-              <w:t xml:space="preserve">import numpy as np, joblib</w:t>
+              <w:t xml:space="preserve">    for angle in (-10, 10):                       # xoay +-10 do</w:t>
             </w:r>
           </w:p>
           <w:p>
@@ -7898,7 +7563,7 @@
                 <w:sz w:val="20"/>
                 <w:szCs w:val="20"/>
               </w:rPr>
-              <w:t xml:space="preserve"/>
+              <w:t xml:space="preserve">        M = cv2.getRotationMatrix2D((32, 32), angle, 1.0)</w:t>
             </w:r>
           </w:p>
           <w:p>
@@ -7911,7 +7576,7 @@
                 <w:sz w:val="20"/>
                 <w:szCs w:val="20"/>
               </w:rPr>
-              <w:t xml:space="preserve">X = np.load('data/processed/X.npy')   # (n_samples, 1764)</w:t>
+              <w:t xml:space="preserve">        outs.append(cv2.warpAffine(img, M, (64, 64)))</w:t>
             </w:r>
           </w:p>
           <w:p>
@@ -7924,7 +7589,7 @@
                 <w:sz w:val="20"/>
                 <w:szCs w:val="20"/>
               </w:rPr>
-              <w:t xml:space="preserve">y = np.load('data/processed/y.npy')   # nhãn identity hoặc liveness</w:t>
+              <w:t xml:space="preserve">    for beta in (-30, 30):                         # thay do sang</w:t>
             </w:r>
           </w:p>
           <w:p>
@@ -7937,7 +7602,7 @@
                 <w:sz w:val="20"/>
                 <w:szCs w:val="20"/>
               </w:rPr>
-              <w:t xml:space="preserve"/>
+              <w:t xml:space="preserve">        outs.append(cv2.convertScaleAbs(img, alpha=1.0, beta=beta))</w:t>
             </w:r>
           </w:p>
           <w:p>
@@ -7950,7 +7615,7 @@
                 <w:sz w:val="20"/>
                 <w:szCs w:val="20"/>
               </w:rPr>
-              <w:t xml:space="preserve">X_train, X_test, y_train, y_test = train_test_split(</w:t>
+              <w:t xml:space="preserve">    return outs   # 1 anh goc -&gt; 6 anh (gap ~6 lan)</w:t>
             </w:r>
           </w:p>
           <w:p>
@@ -7963,7 +7628,7 @@
                 <w:sz w:val="20"/>
                 <w:szCs w:val="20"/>
               </w:rPr>
-              <w:t xml:space="preserve">    X, y, test_size=0.2, stratify=y, random_state=42)</w:t>
+              <w:t xml:space="preserve"/>
             </w:r>
           </w:p>
           <w:p>
@@ -7976,7 +7641,7 @@
                 <w:sz w:val="20"/>
                 <w:szCs w:val="20"/>
               </w:rPr>
-              <w:t xml:space="preserve"/>
+              <w:t xml:space="preserve">def make_synthetic_spoof(img):</w:t>
             </w:r>
           </w:p>
           <w:p>
@@ -7989,7 +7654,7 @@
                 <w:sz w:val="20"/>
                 <w:szCs w:val="20"/>
               </w:rPr>
-              <w:t xml:space="preserve">clf = LinearSVC(C=1.0, class_weight='balanced')</w:t>
+              <w:t xml:space="preserve">    hsv = cv2.cvtColor(img, cv2.COLOR_BGR2HSV).astype(np.float32)</w:t>
             </w:r>
           </w:p>
           <w:p>
@@ -8002,7 +7667,7 @@
                 <w:sz w:val="20"/>
                 <w:szCs w:val="20"/>
               </w:rPr>
-              <w:t xml:space="preserve">clf.fit(X_train, y_train)</w:t>
+              <w:t xml:space="preserve">    hsv[..., 1] *= 0.5                            # giam bao hoa: mo phong anh in</w:t>
             </w:r>
           </w:p>
           <w:p>
@@ -8015,7 +7680,7 @@
                 <w:sz w:val="20"/>
                 <w:szCs w:val="20"/>
               </w:rPr>
-              <w:t xml:space="preserve"/>
+              <w:t xml:space="preserve">    printed = cv2.cvtColor(hsv.astype(np.uint8), cv2.COLOR_HSV2BGR)</w:t>
             </w:r>
           </w:p>
           <w:p>
@@ -8028,7 +7693,7 @@
                 <w:sz w:val="20"/>
                 <w:szCs w:val="20"/>
               </w:rPr>
-              <w:t xml:space="preserve">print('Test accuracy:', clf.score(X_test, y_test))</w:t>
+              <w:t xml:space="preserve">    printed = cv2.GaussianBlur(printed + np.random.normal(0, 8, img.shape), (3, 3), 0)</w:t>
             </w:r>
           </w:p>
           <w:p>
@@ -8041,7 +7706,46 @@
                 <w:sz w:val="20"/>
                 <w:szCs w:val="20"/>
               </w:rPr>
-              <w:t xml:space="preserve">joblib.dump(clf, 'models/model_identity.pkl')</w:t>
+              <w:t xml:space="preserve">    mask = cv2.GaussianBlur(cv2.circle(                # vignette: mo phong man hinh</w:t>
+            </w:r>
+          </w:p>
+          <w:p>
+            <w:pPr>
+              <w:spacing w:after="40"/>
+            </w:pPr>
+            <w:r>
+              <w:rPr>
+                <w:rFonts w:ascii="Consolas" w:cs="Consolas" w:eastAsia="Consolas" w:hAnsi="Consolas"/>
+                <w:sz w:val="20"/>
+                <w:szCs w:val="20"/>
+              </w:rPr>
+              <w:t xml:space="preserve">        np.zeros(img.shape[:2], np.float32), (32, 32), 38, 1.0, -1), (25, 25), 0)</w:t>
+            </w:r>
+          </w:p>
+          <w:p>
+            <w:pPr>
+              <w:spacing w:after="40"/>
+            </w:pPr>
+            <w:r>
+              <w:rPr>
+                <w:rFonts w:ascii="Consolas" w:cs="Consolas" w:eastAsia="Consolas" w:hAnsi="Consolas"/>
+                <w:sz w:val="20"/>
+                <w:szCs w:val="20"/>
+              </w:rPr>
+              <w:t xml:space="preserve">    screen = (img.astype(np.float32) * mask[..., None]).astype(np.uint8)</w:t>
+            </w:r>
+          </w:p>
+          <w:p>
+            <w:pPr>
+              <w:spacing w:after="40"/>
+            </w:pPr>
+            <w:r>
+              <w:rPr>
+                <w:rFonts w:ascii="Consolas" w:cs="Consolas" w:eastAsia="Consolas" w:hAnsi="Consolas"/>
+                <w:sz w:val="20"/>
+                <w:szCs w:val="20"/>
+              </w:rPr>
+              <w:t xml:space="preserve">    return printed.astype(np.uint8), screen</w:t>
             </w:r>
           </w:p>
         </w:tc>
@@ -8049,7 +7753,150 @@
     </w:tbl>
     <w:p>
       <w:pPr>
-        <w:spacing w:after="160" w:line="360"/>
+        <w:spacing w:after="160" w:line="340"/>
+        <w:jc w:val="both"/>
+      </w:pPr>
+      <w:r>
+        <w:rPr>
+          <w:rFonts w:ascii="Times New Roman" w:cs="Times New Roman" w:eastAsia="Times New Roman" w:hAnsi="Times New Roman"/>
+          <w:b w:val="false"/>
+          <w:bCs w:val="false"/>
+          <w:i w:val="false"/>
+          <w:iCs w:val="false"/>
+          <w:sz w:val="26"/>
+          <w:szCs w:val="26"/>
+        </w:rPr>
+        <w:t xml:space="preserve">augment_real() sinh thêm 6 phiên bản cho mỗi ảnh thật gốc; make_synthetic_spoof() tạo hai kiểu ảnh giả mạo tổng hợp: ảnh in giấy (giảm bão hoà + nhiễu + mờ nhẹ) và ảnh chụp lại từ màn hình (vignette + vệt sáng cục bộ). Cả hai script chạy trước preprocess.py.</w:t>
+      </w:r>
+    </w:p>
+    <w:p>
+      <w:pPr>
+        <w:pStyle w:val="Heading2"/>
+        <w:spacing w:after="160" w:before="260"/>
+      </w:pPr>
+      <w:r>
+        <w:rPr>
+          <w:rFonts w:ascii="Times New Roman" w:cs="Times New Roman" w:eastAsia="Times New Roman" w:hAnsi="Times New Roman"/>
+          <w:b/>
+          <w:bCs/>
+          <w:color w:val="2E5395"/>
+          <w:sz w:val="28"/>
+          <w:szCs w:val="28"/>
+        </w:rPr>
+        <w:t xml:space="preserve">B.3. Huấn luyện SVM (train_svm.py)</w:t>
+      </w:r>
+    </w:p>
+    <w:tbl>
+      <w:tblPr>
+        <w:tblW w:type="dxa" w:w="9000"/>
+        <w:tblBorders>
+          <w:top w:val="single" w:color="auto" w:sz="4"/>
+          <w:left w:val="single" w:color="auto" w:sz="4"/>
+          <w:bottom w:val="single" w:color="auto" w:sz="4"/>
+          <w:right w:val="single" w:color="auto" w:sz="4"/>
+          <w:insideH w:val="single" w:color="auto" w:sz="4"/>
+          <w:insideV w:val="single" w:color="auto" w:sz="4"/>
+        </w:tblBorders>
+      </w:tblPr>
+      <w:tblGrid>
+        <w:gridCol w:w="100"/>
+      </w:tblGrid>
+      <w:tr>
+        <w:tc>
+          <w:tcPr>
+            <w:tcW w:type="dxa" w:w="9000"/>
+            <w:shd w:fill="F2F2F2" w:val="clear"/>
+            <w:tcMar>
+              <w:top w:type="dxa" w:w="120"/>
+              <w:left w:type="dxa" w:w="160"/>
+              <w:bottom w:type="dxa" w:w="120"/>
+              <w:right w:type="dxa" w:w="160"/>
+            </w:tcMar>
+          </w:tcPr>
+          <w:p>
+            <w:pPr>
+              <w:spacing w:after="40"/>
+            </w:pPr>
+            <w:r>
+              <w:rPr>
+                <w:rFonts w:ascii="Consolas" w:cs="Consolas" w:eastAsia="Consolas" w:hAnsi="Consolas"/>
+                <w:sz w:val="20"/>
+                <w:szCs w:val="20"/>
+              </w:rPr>
+              <w:t xml:space="preserve">X, y = np.load('data/processed/X.npy'), np.load('data/processed/y.npy')</w:t>
+            </w:r>
+          </w:p>
+          <w:p>
+            <w:pPr>
+              <w:spacing w:after="40"/>
+            </w:pPr>
+            <w:r>
+              <w:rPr>
+                <w:rFonts w:ascii="Consolas" w:cs="Consolas" w:eastAsia="Consolas" w:hAnsi="Consolas"/>
+                <w:sz w:val="20"/>
+                <w:szCs w:val="20"/>
+              </w:rPr>
+              <w:t xml:space="preserve">X_train, X_test, y_train, y_test = train_test_split(</w:t>
+            </w:r>
+          </w:p>
+          <w:p>
+            <w:pPr>
+              <w:spacing w:after="40"/>
+            </w:pPr>
+            <w:r>
+              <w:rPr>
+                <w:rFonts w:ascii="Consolas" w:cs="Consolas" w:eastAsia="Consolas" w:hAnsi="Consolas"/>
+                <w:sz w:val="20"/>
+                <w:szCs w:val="20"/>
+              </w:rPr>
+              <w:t xml:space="preserve">    X, y, test_size=0.2, stratify=y, random_state=42)</w:t>
+            </w:r>
+          </w:p>
+          <w:p>
+            <w:pPr>
+              <w:spacing w:after="40"/>
+            </w:pPr>
+            <w:r>
+              <w:rPr>
+                <w:rFonts w:ascii="Consolas" w:cs="Consolas" w:eastAsia="Consolas" w:hAnsi="Consolas"/>
+                <w:sz w:val="20"/>
+                <w:szCs w:val="20"/>
+              </w:rPr>
+              <w:t xml:space="preserve">clf = LinearSVC(C=1.0, class_weight='balanced').fit(X_train, y_train)</w:t>
+            </w:r>
+          </w:p>
+          <w:p>
+            <w:pPr>
+              <w:spacing w:after="40"/>
+            </w:pPr>
+            <w:r>
+              <w:rPr>
+                <w:rFonts w:ascii="Consolas" w:cs="Consolas" w:eastAsia="Consolas" w:hAnsi="Consolas"/>
+                <w:sz w:val="20"/>
+                <w:szCs w:val="20"/>
+              </w:rPr>
+              <w:t xml:space="preserve">print('Test accuracy:', clf.score(X_test, y_test))</w:t>
+            </w:r>
+          </w:p>
+          <w:p>
+            <w:pPr>
+              <w:spacing w:after="40"/>
+            </w:pPr>
+            <w:r>
+              <w:rPr>
+                <w:rFonts w:ascii="Consolas" w:cs="Consolas" w:eastAsia="Consolas" w:hAnsi="Consolas"/>
+                <w:sz w:val="20"/>
+                <w:szCs w:val="20"/>
+              </w:rPr>
+              <w:t xml:space="preserve">joblib.dump(clf, 'models/model_identity.pkl')</w:t>
+            </w:r>
+          </w:p>
+        </w:tc>
+      </w:tr>
+    </w:tbl>
+    <w:p>
+      <w:pPr>
+        <w:spacing w:after="160" w:line="340"/>
         <w:jc w:val="both"/>
       </w:pPr>
       <w:r>
@@ -8084,128 +7931,128 @@
     </w:p>
     <w:p>
       <w:pPr>
-        <w:spacing w:after="160" w:line="360"/>
-        <w:jc w:val="both"/>
-      </w:pPr>
-      <w:r>
-        <w:rPr>
-          <w:rFonts w:ascii="Times New Roman" w:cs="Times New Roman" w:eastAsia="Times New Roman" w:hAnsi="Times New Roman"/>
-          <w:b w:val="false"/>
-          <w:bCs w:val="false"/>
-          <w:i w:val="false"/>
-          <w:iCs w:val="false"/>
-          <w:sz w:val="26"/>
-          <w:szCs w:val="26"/>
-        </w:rPr>
-        <w:t xml:space="preserve">[1] N. Dalal and B. Triggs, "Histograms of Oriented Gradients for Human Detection," IEEE CVPR, 2005.</w:t>
-      </w:r>
-    </w:p>
-    <w:p>
-      <w:pPr>
-        <w:spacing w:after="160" w:line="360"/>
-        <w:jc w:val="both"/>
-      </w:pPr>
-      <w:r>
-        <w:rPr>
-          <w:rFonts w:ascii="Times New Roman" w:cs="Times New Roman" w:eastAsia="Times New Roman" w:hAnsi="Times New Roman"/>
-          <w:b w:val="false"/>
-          <w:bCs w:val="false"/>
-          <w:i w:val="false"/>
-          <w:iCs w:val="false"/>
-          <w:sz w:val="26"/>
-          <w:szCs w:val="26"/>
-        </w:rPr>
-        <w:t xml:space="preserve">[2] P. Viola and M. Jones, "Rapid Object Detection using a Boosted Cascade of Simple Features," IEEE CVPR, 2001.</w:t>
-      </w:r>
-    </w:p>
-    <w:p>
-      <w:pPr>
-        <w:spacing w:after="160" w:line="360"/>
-        <w:jc w:val="both"/>
-      </w:pPr>
-      <w:r>
-        <w:rPr>
-          <w:rFonts w:ascii="Times New Roman" w:cs="Times New Roman" w:eastAsia="Times New Roman" w:hAnsi="Times New Roman"/>
-          <w:b w:val="false"/>
-          <w:bCs w:val="false"/>
-          <w:i w:val="false"/>
-          <w:iCs w:val="false"/>
-          <w:sz w:val="26"/>
-          <w:szCs w:val="26"/>
-        </w:rPr>
-        <w:t xml:space="preserve">[3] C. Cortes and V. Vapnik, "Support-Vector Networks," Machine Learning, vol. 20, pp. 273–297, 1995.</w:t>
-      </w:r>
-    </w:p>
-    <w:p>
-      <w:pPr>
-        <w:spacing w:after="160" w:line="360"/>
-        <w:jc w:val="both"/>
-      </w:pPr>
-      <w:r>
-        <w:rPr>
-          <w:rFonts w:ascii="Times New Roman" w:cs="Times New Roman" w:eastAsia="Times New Roman" w:hAnsi="Times New Roman"/>
-          <w:b w:val="false"/>
-          <w:bCs w:val="false"/>
-          <w:i w:val="false"/>
-          <w:iCs w:val="false"/>
-          <w:sz w:val="26"/>
-          <w:szCs w:val="26"/>
-        </w:rPr>
-        <w:t xml:space="preserve">[4] Tài liệu chính thức OpenCV: https://docs.opencv.org</w:t>
-      </w:r>
-    </w:p>
-    <w:p>
-      <w:pPr>
-        <w:spacing w:after="160" w:line="360"/>
-        <w:jc w:val="both"/>
-      </w:pPr>
-      <w:r>
-        <w:rPr>
-          <w:rFonts w:ascii="Times New Roman" w:cs="Times New Roman" w:eastAsia="Times New Roman" w:hAnsi="Times New Roman"/>
-          <w:b w:val="false"/>
-          <w:bCs w:val="false"/>
-          <w:i w:val="false"/>
-          <w:iCs w:val="false"/>
-          <w:sz w:val="26"/>
-          <w:szCs w:val="26"/>
-        </w:rPr>
-        <w:t xml:space="preserve">[5] Tài liệu chính thức scikit-learn (LinearSVC): https://scikit-learn.org</w:t>
-      </w:r>
-    </w:p>
-    <w:p>
-      <w:pPr>
-        <w:spacing w:after="160" w:line="360"/>
-        <w:jc w:val="both"/>
-      </w:pPr>
-      <w:r>
-        <w:rPr>
-          <w:rFonts w:ascii="Times New Roman" w:cs="Times New Roman" w:eastAsia="Times New Roman" w:hAnsi="Times New Roman"/>
-          <w:b w:val="false"/>
-          <w:bCs w:val="false"/>
-          <w:i w:val="false"/>
-          <w:iCs w:val="false"/>
-          <w:sz w:val="26"/>
-          <w:szCs w:val="26"/>
-        </w:rPr>
-        <w:t xml:space="preserve">[6] Tài liệu chính thức Streamlit: https://docs.streamlit.io</w:t>
-      </w:r>
-    </w:p>
-    <w:p>
-      <w:pPr>
-        <w:spacing w:after="160" w:line="360"/>
-        <w:jc w:val="both"/>
-      </w:pPr>
-      <w:r>
-        <w:rPr>
-          <w:rFonts w:ascii="Times New Roman" w:cs="Times New Roman" w:eastAsia="Times New Roman" w:hAnsi="Times New Roman"/>
-          <w:b w:val="false"/>
-          <w:bCs w:val="false"/>
-          <w:i w:val="false"/>
-          <w:iCs w:val="false"/>
-          <w:sz w:val="26"/>
-          <w:szCs w:val="26"/>
-        </w:rPr>
-        <w:t xml:space="preserve">[7] Slide bài giảng môn Thị giác máy tính, UMT, học kỳ hè 2026.</w:t>
+        <w:spacing w:after="160" w:line="340"/>
+        <w:jc w:val="both"/>
+      </w:pPr>
+      <w:r>
+        <w:rPr>
+          <w:rFonts w:ascii="Times New Roman" w:cs="Times New Roman" w:eastAsia="Times New Roman" w:hAnsi="Times New Roman"/>
+          <w:b w:val="false"/>
+          <w:bCs w:val="false"/>
+          <w:i w:val="false"/>
+          <w:iCs w:val="false"/>
+          <w:sz w:val="26"/>
+          <w:szCs w:val="26"/>
+        </w:rPr>
+        <w:t xml:space="preserve">Dalal, N., &amp; Triggs, B. (2005). Histograms of oriented gradients for human detection. In Proceedings of the IEEE Conference on Computer Vision and Pattern Recognition (CVPR) (Vol. 1, pp. 886–893).</w:t>
+      </w:r>
+    </w:p>
+    <w:p>
+      <w:pPr>
+        <w:spacing w:after="160" w:line="340"/>
+        <w:jc w:val="both"/>
+      </w:pPr>
+      <w:r>
+        <w:rPr>
+          <w:rFonts w:ascii="Times New Roman" w:cs="Times New Roman" w:eastAsia="Times New Roman" w:hAnsi="Times New Roman"/>
+          <w:b w:val="false"/>
+          <w:bCs w:val="false"/>
+          <w:i w:val="false"/>
+          <w:iCs w:val="false"/>
+          <w:sz w:val="26"/>
+          <w:szCs w:val="26"/>
+        </w:rPr>
+        <w:t xml:space="preserve">Viola, P., &amp; Jones, M. (2001). Rapid object detection using a boosted cascade of simple features. In Proceedings of the IEEE Conference on Computer Vision and Pattern Recognition (CVPR).</w:t>
+      </w:r>
+    </w:p>
+    <w:p>
+      <w:pPr>
+        <w:spacing w:after="160" w:line="340"/>
+        <w:jc w:val="both"/>
+      </w:pPr>
+      <w:r>
+        <w:rPr>
+          <w:rFonts w:ascii="Times New Roman" w:cs="Times New Roman" w:eastAsia="Times New Roman" w:hAnsi="Times New Roman"/>
+          <w:b w:val="false"/>
+          <w:bCs w:val="false"/>
+          <w:i w:val="false"/>
+          <w:iCs w:val="false"/>
+          <w:sz w:val="26"/>
+          <w:szCs w:val="26"/>
+        </w:rPr>
+        <w:t xml:space="preserve">Cortes, C., &amp; Vapnik, V. (1995). Support-vector networks. Machine Learning, 20(3), 273–297.</w:t>
+      </w:r>
+    </w:p>
+    <w:p>
+      <w:pPr>
+        <w:spacing w:after="160" w:line="340"/>
+        <w:jc w:val="both"/>
+      </w:pPr>
+      <w:r>
+        <w:rPr>
+          <w:rFonts w:ascii="Times New Roman" w:cs="Times New Roman" w:eastAsia="Times New Roman" w:hAnsi="Times New Roman"/>
+          <w:b w:val="false"/>
+          <w:bCs w:val="false"/>
+          <w:i w:val="false"/>
+          <w:iCs w:val="false"/>
+          <w:sz w:val="26"/>
+          <w:szCs w:val="26"/>
+        </w:rPr>
+        <w:t xml:space="preserve">Pedregosa, F., Varoquaux, G., Gramfort, A., Michel, V., Thirion, B., Grisel, O., ... &amp; Duchesnay, E. (2011). Scikit-learn: Machine Learning in Python. Journal of Machine Learning Research, 12, 2825–2830.</w:t>
+      </w:r>
+    </w:p>
+    <w:p>
+      <w:pPr>
+        <w:spacing w:after="160" w:line="340"/>
+        <w:jc w:val="both"/>
+      </w:pPr>
+      <w:r>
+        <w:rPr>
+          <w:rFonts w:ascii="Times New Roman" w:cs="Times New Roman" w:eastAsia="Times New Roman" w:hAnsi="Times New Roman"/>
+          <w:b w:val="false"/>
+          <w:bCs w:val="false"/>
+          <w:i w:val="false"/>
+          <w:iCs w:val="false"/>
+          <w:sz w:val="26"/>
+          <w:szCs w:val="26"/>
+        </w:rPr>
+        <w:t xml:space="preserve">OpenCV Team. (2024). Open Source Computer Vision Library. Truy xuất từ https://opencv.org/</w:t>
+      </w:r>
+    </w:p>
+    <w:p>
+      <w:pPr>
+        <w:spacing w:after="160" w:line="340"/>
+        <w:jc w:val="both"/>
+      </w:pPr>
+      <w:r>
+        <w:rPr>
+          <w:rFonts w:ascii="Times New Roman" w:cs="Times New Roman" w:eastAsia="Times New Roman" w:hAnsi="Times New Roman"/>
+          <w:b w:val="false"/>
+          <w:bCs w:val="false"/>
+          <w:i w:val="false"/>
+          <w:iCs w:val="false"/>
+          <w:sz w:val="26"/>
+          <w:szCs w:val="26"/>
+        </w:rPr>
+        <w:t xml:space="preserve">Streamlit Inc. (2024). Streamlit Documentation. Truy xuất từ https://docs.streamlit.io/</w:t>
+      </w:r>
+    </w:p>
+    <w:p>
+      <w:pPr>
+        <w:spacing w:after="160" w:line="340"/>
+        <w:jc w:val="both"/>
+      </w:pPr>
+      <w:r>
+        <w:rPr>
+          <w:rFonts w:ascii="Times New Roman" w:cs="Times New Roman" w:eastAsia="Times New Roman" w:hAnsi="Times New Roman"/>
+          <w:b w:val="false"/>
+          <w:bCs w:val="false"/>
+          <w:i w:val="false"/>
+          <w:iCs w:val="false"/>
+          <w:sz w:val="26"/>
+          <w:szCs w:val="26"/>
+        </w:rPr>
+        <w:t xml:space="preserve">Slide bài giảng môn Thị giác máy tính, UMT, học kỳ hè 2026.</w:t>
       </w:r>
     </w:p>
     <w:sectPr>

</xml_diff>